<commit_message>
Corregir entregable ACME Rally Latam 2026 sobre la plantilla original
Co-Authored-By: Claude Sonnet 5.5 <noreply@anthropic.com>
Claude-Session: https://claude.ai/code/session_017gE6Pwq5b5gtjDGsqy7MmM
</commit_message>
<xml_diff>
--- a/ACME_ULSA-Nic_RallyLatam2026_corregido.docx
+++ b/ACME_ULSA-Nic_RallyLatam2026_corregido.docx
@@ -194,7 +194,6 @@
     </w:p>
     <w:p>
       <w:pPr>
-        <w:keepNext/>
         <w:numPr>
           <w:ilvl w:val="0"/>
           <w:numId w:val="1"/>
@@ -228,7 +227,6 @@
     </w:p>
     <w:p>
       <w:pPr>
-        <w:keepNext/>
         <w:jc w:val="both"/>
         <w:rPr>
           <w:sz w:val="20"/>
@@ -246,8 +244,6 @@
     <w:p>
       <w:pPr>
         <w:pStyle w:val="NormalWeb"/>
-        <w:keepLines/>
-        <w:widowControl/>
         <w:pBdr>
           <w:top w:val="single" w:sz="4" w:space="1" w:color="000000"/>
           <w:left w:val="single" w:sz="4" w:space="4" w:color="000000"/>
@@ -256,14 +252,16 @@
         </w:pBdr>
         <w:spacing w:before="0" w:beforeAutospacing="0" w:after="160" w:afterAutospacing="0"/>
       </w:pPr>
-      <w:r>
-        <w:rPr>
-          <w:rFonts w:ascii="Calibri" w:hAnsi="Calibri"/>
-          <w:b w:val="0"/>
-          <w:color w:val="000000"/>
-          <w:sz w:val="20"/>
-        </w:rPr>
-        <w:t>La poda urbana puede convertirse en un problema ambiental, económico y logístico cuando falta coordinación para separarla, tratarla y comercializarla. Existen experiencias de aprovechamiento, como Proyecto Hormiga en Argentina (Silbert Voldman et al., 2025). En América Latina y el Caribe, el 52 % de los residuos urbanos es orgánico; del total de residuos urbanos, cerca del 1 % se trata por compostaje, digestión o incineración y el 26,8 % termina en botaderos a cielo abierto (Correal y Rihm, 2022). Los residuos verdes representan entre el 6 % y el 60 % de la basura municipal en los casos recopilados por Garrido et al. (2021); este rango no es una medición de León. En Nicaragua, la estrategia de 2011 señalaba que casi toda la leña provenía de bosques naturales (Ministerio de Energía y Minas et al., 2011). ReVerde aborda la desconexión entre quienes generan poda, quienes la transportan y quienes pueden aprovecharla. Su separación y tratamiento permitirían recuperar materia orgánica útil para los suelos (De Anda-Trasviña et al., 2021).</w:t>
+      <w:bookmarkStart w:id="3" w:name="bookmark=id.1hnyemn7r85b" w:colFirst="0" w:colLast="0"/>
+      <w:bookmarkEnd w:id="3"/>
+      <w:r>
+        <w:rPr>
+          <w:rFonts w:ascii="Calibri" w:hAnsi="Calibri" w:cs="Calibri"/>
+          <w:color w:val="000000"/>
+          <w:sz w:val="20"/>
+          <w:szCs w:val="20"/>
+        </w:rPr>
+        <w:t xml:space="preserve">La poda urbana puede convertirse en un problema ambiental, económico y logístico cuando falta coordinación para separarla, tratarla y comercializarla. Existen experiencias de aprovechamiento, como Proyecto Hormiga en Argentina (Silbert Voldman et al., 2025). En América Latina y el Caribe, el 52 % de los residuos urbanos es orgánico; del total de residuos urbanos, cerca del 1 % se trata por compostaje, digestión o incineración y el 26,8 % termina en botaderos a cielo abierto (Correal y Rihm, 2022). Los residuos verdes representan entre el 6 % y el 60 % de la basura municipal en los casos recopilados por Garrido et al. (2021); este rango no es una medición de León. En Nicaragua, la estrategia de 2011 señalaba que casi toda la leña provenía de bosques naturales (Ministerio de Energía y Minas et al., 2011). ReVerde aborda la desconexión entre quienes generan poda, quienes la transportan y quienes pueden aprovecharla. Su separación y tratamiento permitirían recuperar materia orgánica útil para los suelos (De Anda-Trasviña et al., 2021).</w:t>
       </w:r>
     </w:p>
     <w:p>
@@ -278,7 +276,6 @@
     </w:p>
     <w:p>
       <w:pPr>
-        <w:keepNext/>
         <w:numPr>
           <w:ilvl w:val="0"/>
           <w:numId w:val="1"/>
@@ -312,7 +309,6 @@
     </w:p>
     <w:p>
       <w:pPr>
-        <w:keepNext/>
         <w:jc w:val="both"/>
         <w:rPr>
           <w:sz w:val="20"/>
@@ -329,7 +325,6 @@
     </w:p>
     <w:p>
       <w:pPr>
-        <w:widowControl/>
         <w:pBdr>
           <w:top w:val="single" w:sz="4" w:space="1" w:color="000000"/>
           <w:left w:val="single" w:sz="4" w:space="4" w:color="000000"/>
@@ -342,19 +337,18 @@
           <w:szCs w:val="20"/>
         </w:rPr>
       </w:pPr>
-      <w:r>
-        <w:rPr>
-          <w:rFonts w:ascii="Calibri" w:hAnsi="Calibri"/>
-          <w:b w:val="0"/>
-          <w:color w:val="000000"/>
-          <w:sz w:val="20"/>
-        </w:rPr>
-        <w:t>ReVerde propone centros de acopio y tratamiento distribuidos en la ciudad para recibir residuos limpios de poda y jardinería. Las hojas y ramas delgadas se destinarán al compostaje y los troncos, a leña seca. Los vecinos podrán llevar su poda o solicitar su recogida a transportistas independientes. El abono y la leña se venderán según disponibilidad; los vecinos también podrán canjear puntos por abono, conforme al programa de incentivos.</w:t>
-      </w:r>
-    </w:p>
-    <w:p>
-      <w:pPr>
-        <w:widowControl/>
+      <w:bookmarkStart w:id="4" w:name="bookmark=id.fm2ujm30ols2" w:colFirst="0" w:colLast="0"/>
+      <w:bookmarkEnd w:id="4"/>
+      <w:r>
+        <w:rPr>
+          <w:sz w:val="20"/>
+          <w:szCs w:val="20"/>
+        </w:rPr>
+        <w:t xml:space="preserve">ReVerde propone centros de acopio y tratamiento distribuidos en la ciudad para recibir residuos limpios de poda y jardinería. Las hojas y ramas delgadas se destinarán al compostaje y los troncos, a leña seca. Los vecinos podrán llevar su poda o solicitar su recogida a transportistas independientes. El abono y la leña se venderán según disponibilidad; los vecinos también podrán canjear puntos por abono, conforme al programa de incentivos.</w:t>
+      </w:r>
+    </w:p>
+    <w:p>
+      <w:pPr>
         <w:pBdr>
           <w:top w:val="single" w:sz="4" w:space="1" w:color="000000"/>
           <w:left w:val="single" w:sz="4" w:space="4" w:color="000000"/>
@@ -369,17 +363,14 @@
       </w:pPr>
       <w:r>
         <w:rPr>
-          <w:rFonts w:ascii="Calibri" w:hAnsi="Calibri"/>
-          <w:b w:val="0"/>
-          <w:color w:val="000000"/>
-          <w:sz w:val="20"/>
-        </w:rPr>
-        <w:t>Los centros utilizarán trituradoras comerciales con motor eléctrico, buscando reducir costos de operación; una minicargadora para voltear las pilas de compost y una zaranda para separar el abono fino. Los troncos se cortarán con motosierra, se rajarán y se secarán bajo techo. La calidad se controlará con termómetros, medidores de humedad y análisis de laboratorio. La implementación requerirá terreno, suministro eléctrico adecuado, drenajes y convenios de abastecimiento.</w:t>
-      </w:r>
-    </w:p>
-    <w:p>
-      <w:pPr>
-        <w:widowControl/>
+          <w:sz w:val="20"/>
+          <w:szCs w:val="20"/>
+        </w:rPr>
+        <w:t xml:space="preserve">Los centros utilizarán trituradoras comerciales con motor eléctrico, buscando reducir costos de operación; una minicargadora para voltear las pilas de compost y una zaranda para separar el abono fino. Los troncos se cortarán con motosierra, se rajarán y se secarán bajo techo. La calidad se controlará con termómetros, medidores de humedad y análisis de laboratorio. La implementación requerirá terreno, suministro eléctrico adecuado, drenajes y convenios de abastecimiento.</w:t>
+      </w:r>
+    </w:p>
+    <w:p>
+      <w:pPr>
         <w:pBdr>
           <w:top w:val="single" w:sz="4" w:space="1" w:color="000000"/>
           <w:left w:val="single" w:sz="4" w:space="4" w:color="000000"/>
@@ -394,17 +385,15 @@
       </w:pPr>
       <w:r>
         <w:rPr>
-          <w:rFonts w:ascii="Calibri" w:hAnsi="Calibri"/>
-          <w:b w:val="0"/>
-          <w:color w:val="000000"/>
-          <w:sz w:val="20"/>
-        </w:rPr>
-        <w:t>Una aplicación web progresiva (PWA), accesible desde el navegador e instalable en el celular, conectará a ciudadanos, centros, transportistas y compradores para coordinar recogidas, entregas y ventas.</w:t>
-      </w:r>
-    </w:p>
-    <w:p>
-      <w:pPr>
-        <w:keepNext/>
+          <w:sz w:val="20"/>
+          <w:szCs w:val="20"/>
+        </w:rPr>
+        <w:t xml:space="preserve">Una aplicación web progresiva (PWA), accesible desde el navegador e instalable en el celular, conectará a ciudadanos, centros, transportistas y compradores para coordinar recogidas, entregas y ventas.</w:t>
+      </w:r>
+    </w:p>
+    <w:p>
+      <w:pPr>
+        <w:pageBreakBefore/>
         <w:numPr>
           <w:ilvl w:val="0"/>
           <w:numId w:val="1"/>
@@ -438,7 +427,6 @@
     </w:p>
     <w:p>
       <w:pPr>
-        <w:keepNext/>
         <w:jc w:val="both"/>
         <w:rPr>
           <w:sz w:val="20"/>
@@ -455,8 +443,6 @@
     </w:p>
     <w:p>
       <w:pPr>
-        <w:keepLines/>
-        <w:widowControl/>
         <w:pBdr>
           <w:top w:val="single" w:sz="4" w:space="1" w:color="000000"/>
           <w:left w:val="single" w:sz="4" w:space="4" w:color="000000"/>
@@ -469,19 +455,18 @@
           <w:szCs w:val="20"/>
         </w:rPr>
       </w:pPr>
-      <w:r>
-        <w:rPr>
-          <w:rFonts w:ascii="Calibri" w:hAnsi="Calibri"/>
-          <w:b w:val="0"/>
-          <w:color w:val="000000"/>
-          <w:sz w:val="20"/>
-        </w:rPr>
-        <w:t>Los centros de acopio podrían generar empleo para operarios y oportunidades de ingreso para transportistas locales. La cooperativa El Álamo de Buenos Aires ofrece un antecedente de inclusión laboral en el reciclaje, aunque no de tratamiento de poda (Alessio detto Grassi, 2023). Transformar hojas y ramas en compost busca reducir la quema y el envío de poda a vertederos; aprovechar los troncos como leña seca podría sustituir parte de la madera extraída de bosques. Como referencia externa, Proyecto Hormiga (s. f.) informa haber evitado 666,25 t de CO₂ equivalente mediante su gestión de residuos de poda; no es un resultado de ReVerde. La plataforma facilitará la coordinación entre generadores, transportistas, centros y compradores, y los incentivos promoverán la entrega de poda limpia. En el piloto se medirán toneladas recibidas y aprovechadas, empleos e ingresos generados y beneficios ambientales.</w:t>
-      </w:r>
-    </w:p>
-    <w:p>
-      <w:pPr>
-        <w:keepNext/>
+      <w:bookmarkStart w:id="5" w:name="bookmark=id.jr9nhn6odm9p" w:colFirst="0" w:colLast="0"/>
+      <w:bookmarkEnd w:id="5"/>
+      <w:r>
+        <w:rPr>
+          <w:sz w:val="20"/>
+          <w:szCs w:val="20"/>
+        </w:rPr>
+        <w:t xml:space="preserve">Los centros de acopio podrían generar empleo para operarios y oportunidades de ingreso para transportistas locales. La cooperativa El Álamo de Buenos Aires ofrece un antecedente de inclusión laboral en el reciclaje, aunque no de tratamiento de poda (Alessio detto Grassi, 2023). Transformar hojas y ramas en compost busca reducir la quema y el envío de poda a vertederos; aprovechar los troncos como leña seca podría sustituir parte de la madera extraída de bosques. Como referencia externa, Proyecto Hormiga (s. f.) informa haber evitado 666,25 t de CO₂ equivalente mediante su gestión de residuos de poda; no es un resultado de ReVerde. La plataforma facilitará la coordinación entre generadores, transportistas, centros y compradores, y los incentivos promoverán la entrega de poda limpia. En el piloto se medirán toneladas recibidas y aprovechadas, empleos e ingresos generados y beneficios ambientales.</w:t>
+      </w:r>
+    </w:p>
+    <w:p>
+      <w:pPr>
         <w:numPr>
           <w:ilvl w:val="0"/>
           <w:numId w:val="1"/>
@@ -515,7 +500,6 @@
     </w:p>
     <w:p>
       <w:pPr>
-        <w:keepNext/>
         <w:jc w:val="both"/>
         <w:rPr>
           <w:sz w:val="20"/>
@@ -532,8 +516,6 @@
     </w:p>
     <w:p>
       <w:pPr>
-        <w:keepLines/>
-        <w:widowControl/>
         <w:pBdr>
           <w:top w:val="single" w:sz="4" w:space="1" w:color="000000"/>
           <w:left w:val="single" w:sz="4" w:space="4" w:color="000000"/>
@@ -546,20 +528,18 @@
           <w:szCs w:val="20"/>
         </w:rPr>
       </w:pPr>
-      <w:r>
-        <w:rPr>
-          <w:rFonts w:ascii="Calibri" w:hAnsi="Calibri"/>
-          <w:b w:val="0"/>
-          <w:color w:val="000000"/>
-          <w:sz w:val="20"/>
-        </w:rPr>
-        <w:t>La innovación de ReVerde consiste en integrar centros de acopio, ciudadanos, transportistas independientes y compradores en una plataforma. La app coordinará la recogida de poda y la venta de abono y leña, buscando aprovechar los viajes de regreso para entregar productos. Un mapa mostrará los centros cercanos y cada lote tendrá un código QR para consultar su origen y procesamiento. El registro de horas de uso y toneladas trituradas ayudará a programar el mantenimiento y reducir interrupciones. La Cooperativa Proyecto Hormiga dejó de producir enmiendas y sustratos en 2023 por dificultades en la provisión municipal de material triturado, asociadas al mantenimiento de las máquinas y a la puesta a punto de una trituradora (Silbert Voldman et al., 2025). ReVerde combina tratamiento, logística, comercialización y seguimiento en un modelo adaptable a otras ciudades de Latinoamérica.</w:t>
-      </w:r>
-    </w:p>
-    <w:p>
-      <w:pPr>
-        <w:keepNext/>
-        <w:widowControl/>
+      <w:bookmarkStart w:id="6" w:name="bookmark=id.8v3gv05jw31z" w:colFirst="0" w:colLast="0"/>
+      <w:bookmarkEnd w:id="6"/>
+      <w:r>
+        <w:rPr>
+          <w:sz w:val="20"/>
+          <w:szCs w:val="20"/>
+        </w:rPr>
+        <w:t xml:space="preserve">La innovación de ReVerde consiste en integrar centros de acopio, ciudadanos, transportistas independientes y compradores en una plataforma. La app coordinará la recogida de poda y la venta de abono y leña, buscando aprovechar los viajes de regreso para entregar productos. Cada lote tendrá un código QR para consultar su origen y procesamiento. El registro de horas de uso y toneladas trituradas ayudará a programar el mantenimiento y reducir interrupciones como las que, por fallas de maquinaria y de abastecimiento, llevaron a la cooperativa que en 2022 desarrolló Siempremonte a dejar de producir enmiendas y sustratos en 2023 (Silbert Voldman et al., 2025). ReVerde combina tratamiento, logística, comercialización y seguimiento en un modelo adaptable a otras ciudades de Latinoamérica.</w:t>
+      </w:r>
+    </w:p>
+    <w:p>
+      <w:pPr>
         <w:numPr>
           <w:ilvl w:val="0"/>
           <w:numId w:val="1"/>
@@ -582,17 +562,17 @@
       </w:pPr>
       <w:r>
         <w:rPr>
-          <w:rFonts w:ascii="Calibri" w:hAnsi="Calibri"/>
           <w:b/>
-          <w:color w:val="000000"/>
-          <w:sz w:val="20"/>
-        </w:rPr>
-        <w:t>PREFACTIBILIDAD ECONÓMICA, SOCIAL Y SUSTENTABILIDAD AMBIENTAL (1500 caracteres)</w:t>
-      </w:r>
-    </w:p>
-    <w:p>
-      <w:pPr>
-        <w:keepNext/>
+          <w:bCs/>
+          <w:color w:val="000000"/>
+          <w:sz w:val="20"/>
+          <w:szCs w:val="20"/>
+        </w:rPr>
+        <w:t>PRE FACTIBILIDAD ECONÓMICA, SOCIAL Y SUSTENTABILIDAD AMBIENTAL (1500 caracteres)</w:t>
+      </w:r>
+    </w:p>
+    <w:p>
+      <w:pPr>
         <w:jc w:val="both"/>
         <w:rPr>
           <w:sz w:val="20"/>
@@ -609,7 +589,6 @@
     </w:p>
     <w:p>
       <w:pPr>
-        <w:widowControl/>
         <w:pBdr>
           <w:top w:val="single" w:sz="4" w:space="1" w:color="000000"/>
           <w:left w:val="single" w:sz="4" w:space="4" w:color="000000"/>
@@ -624,19 +603,21 @@
           <w:lang w:val="es-GT"/>
         </w:rPr>
       </w:pPr>
-      <w:r>
-        <w:rPr>
-          <w:rFonts w:ascii="Calibri" w:hAnsi="Calibri"/>
-          <w:b w:val="0"/>
-          <w:color w:val="000000"/>
-          <w:sz w:val="20"/>
-        </w:rPr>
-        <w:t>ReVerde prevé una inversión inicial de US$9,500 a US$12,430, según cálculos actualizados del equipo. El uso de activos municipales en comodato reduciría la inversión, sujeto a convenios. Las trituradoras eléctricas no requieren gasolina para triturar; sus costos dependerán del consumo, la instalación y el mantenimiento. Los ingresos provendrán de acuerdos de recepción de poda y venta de abono y leña seca. Se estima un equilibrio de 740 t/año y una meta de 1,000 t/año, sujetos a los precios y costos previstos. Se reservará capital de trabajo para operar mientras madura el compost y se concretan las primeras ventas.</w:t>
-      </w:r>
-    </w:p>
-    <w:p>
-      <w:pPr>
-        <w:widowControl/>
+      <w:bookmarkStart w:id="7" w:name="bookmark=id.lvjjzipmsrub" w:colFirst="0" w:colLast="0"/>
+      <w:bookmarkEnd w:id="7"/>
+      <w:r>
+        <w:rPr>
+          <w:rFonts w:eastAsia="Times New Roman"/>
+          <w:color w:val="000000"/>
+          <w:sz w:val="20"/>
+          <w:szCs w:val="20"/>
+          <w:lang w:val="es-GT"/>
+        </w:rPr>
+        <w:t xml:space="preserve">ReVerde prevé una inversión inicial de US$9,500 a US$12,430, según cálculos actualizados del equipo. El uso de activos municipales en comodato reduciría la inversión, sujeto a convenios. Las trituradoras eléctricas no requieren gasolina para triturar; sus costos dependerán del consumo, la instalación y el mantenimiento. Los ingresos provendrán de acuerdos de recepción de poda y venta de abono y leña seca. Se estima un equilibrio de 740 t/año y una meta de 1,000 t/año, sujetos a los precios y costos previstos. Se reservará capital de trabajo para operar mientras madura el compost y se concretan las primeras ventas.</w:t>
+      </w:r>
+    </w:p>
+    <w:p>
+      <w:pPr>
         <w:pBdr>
           <w:left w:val="single" w:sz="4" w:space="4" w:color="000000"/>
           <w:right w:val="single" w:sz="4" w:space="4" w:color="000000"/>
@@ -652,17 +633,17 @@
       </w:pPr>
       <w:r>
         <w:rPr>
-          <w:rFonts w:ascii="Calibri" w:hAnsi="Calibri"/>
-          <w:b w:val="0"/>
-          <w:color w:val="000000"/>
-          <w:sz w:val="20"/>
+          <w:rFonts w:eastAsia="Times New Roman"/>
+          <w:color w:val="000000"/>
+          <w:sz w:val="20"/>
+          <w:szCs w:val="20"/>
+          <w:lang w:val="es-GT"/>
         </w:rPr>
         <w:t>En lo social, se propone crear empleo para operarios y oportunidades para transportistas locales, con capacitación, protección personal y prestaciones laborales. La plataforma coordinará recogidas y entregas para aprovechar viajes de regreso y reducir recorridos vacíos. Los vecinos recibirán puntos por entregar poda limpia, canjeables por abono o productos y servicios de negocios aliados, mediante acuerdos.</w:t>
       </w:r>
     </w:p>
     <w:p>
       <w:pPr>
-        <w:widowControl/>
         <w:pBdr>
           <w:left w:val="single" w:sz="4" w:space="4" w:color="000000"/>
           <w:bottom w:val="single" w:sz="4" w:space="1" w:color="000000"/>
@@ -679,17 +660,18 @@
       </w:pPr>
       <w:r>
         <w:rPr>
-          <w:rFonts w:ascii="Calibri" w:hAnsi="Calibri"/>
-          <w:b w:val="0"/>
-          <w:color w:val="000000"/>
-          <w:sz w:val="20"/>
+          <w:rFonts w:eastAsia="Times New Roman"/>
+          <w:color w:val="000000"/>
+          <w:sz w:val="20"/>
+          <w:szCs w:val="20"/>
+          <w:lang w:val="es-GT"/>
         </w:rPr>
         <w:t>En lo ambiental, el aprovechamiento de la poda busca reducir su quema y disposición en vertederos, producir abono y sustituir parte de la leña extraída de bosques. Se propone captar lluvia y reutilizar agua apta para el compostaje, con drenajes y control de escurrimientos. El consumo de agua y los beneficios ambientales se medirán en el piloto. La continuidad dependerá del abastecimiento, las ventas, los convenios municipales y el control de calidad.</w:t>
       </w:r>
     </w:p>
     <w:p>
       <w:pPr>
-        <w:keepNext/>
+        <w:pageBreakBefore/>
         <w:numPr>
           <w:ilvl w:val="0"/>
           <w:numId w:val="1"/>
@@ -724,8 +706,6 @@
     </w:p>
     <w:p>
       <w:pPr>
-        <w:keepNext/>
-        <w:widowControl/>
         <w:pBdr>
           <w:top w:val="nil"/>
           <w:left w:val="nil"/>
@@ -741,22 +721,31 @@
       </w:pPr>
       <w:r>
         <w:rPr>
-          <w:rFonts w:ascii="Calibri" w:hAnsi="Calibri"/>
-          <w:b w:val="0"/>
-          <w:color w:val="000000"/>
-          <w:sz w:val="20"/>
-        </w:rPr>
-        <w:t>Enumere, en caso de haber descartado ideas, las diferentes propuestas que han analizado hasta elegir la actual y mencione brevemente el porqué.</w:t>
-      </w:r>
-    </w:p>
-    <w:p>
-      <w:pPr>
-        <w:widowControl/>
+          <w:color w:val="000000"/>
+        </w:rPr>
+        <w:t xml:space="preserve">Enumere, en caso de haber descartado ideas, las diferentes propuestas que han analizado hasta elegir la actual y mencione brevemente el </w:t>
+      </w:r>
+      <w:proofErr w:type="spellStart"/>
+      <w:r>
+        <w:rPr>
+          <w:color w:val="000000"/>
+        </w:rPr>
+        <w:t>porque</w:t>
+      </w:r>
+      <w:proofErr w:type="spellEnd"/>
+      <w:r>
+        <w:rPr>
+          <w:color w:val="000000"/>
+        </w:rPr>
+        <w:t>.</w:t>
+      </w:r>
+    </w:p>
+    <w:p>
+      <w:pPr>
         <w:pBdr>
           <w:top w:val="single" w:sz="4" w:space="1" w:color="000000"/>
           <w:left w:val="single" w:sz="4" w:space="4" w:color="000000"/>
           <w:right w:val="single" w:sz="4" w:space="4" w:color="000000"/>
-          <w:bottom w:val="single" w:sz="4" w:space="1" w:color="000000"/>
         </w:pBdr>
         <w:spacing w:line="240" w:lineRule="auto"/>
         <w:rPr>
@@ -766,29 +755,153 @@
           <w:lang w:val="es-GT"/>
         </w:rPr>
       </w:pPr>
-      <w:r>
-        <w:rPr>
-          <w:rFonts w:ascii="Calibri" w:hAnsi="Calibri"/>
-          <w:b w:val="0"/>
-          <w:color w:val="000000"/>
-          <w:sz w:val="20"/>
-        </w:rPr>
-        <w:t>1) Quema de poda sin aprovechamiento: se descarta porque desperdicia el material y genera humo y riesgo de incendio.</w:t>
+      <w:bookmarkStart w:id="8" w:name="bookmark=id.lu0mqt998543" w:colFirst="0" w:colLast="0"/>
+      <w:bookmarkEnd w:id="8"/>
+      <w:r>
+        <w:rPr>
+          <w:rFonts w:eastAsia="Times New Roman"/>
+          <w:color w:val="000000"/>
+          <w:lang w:val="es-GT"/>
+        </w:rPr>
+        <w:t xml:space="preserve">1) Quema de poda sin aprovechamiento: se descarta porque desperdicia el material y genera humo y riesgo de incendio.</w:t>
+      </w:r>
+      <w:r>
+        <w:rPr>
+          <w:rFonts w:eastAsia="Times New Roman"/>
+          <w:color w:val="000000"/>
+          <w:lang w:val="es-GT"/>
+        </w:rPr>
         <w:br/>
-        <w:t>2) Biodigestor y biogás: no se selecciona para el piloto porque los residuos verdes no son convenientes como insumo único; su uso requeriría evaluar mezclas con otras materias primas (Garrido et al., 2021).</w:t>
+      </w:r>
+      <w:r>
+        <w:rPr>
+          <w:rFonts w:eastAsia="Times New Roman"/>
+          <w:color w:val="000000"/>
+          <w:lang w:val="es-GT"/>
+        </w:rPr>
+        <w:t xml:space="preserve">2) Biodigestor y biogás: no se selecciona para el piloto porque los residuos verdes no son convenientes como insumo único; su uso requeriría evaluar mezclas con otras materias primas (Garrido et al., 2021).</w:t>
+      </w:r>
+      <w:r>
+        <w:rPr>
+          <w:rFonts w:eastAsia="Times New Roman"/>
+          <w:color w:val="000000"/>
+          <w:lang w:val="es-GT"/>
+        </w:rPr>
         <w:br/>
-        <w:t>3) Biochar o pirólisis: requiere equipos y control térmico específicos; se deja como alternativa para evaluar en una fase posterior.</w:t>
+      </w:r>
+      <w:r>
+        <w:rPr>
+          <w:rFonts w:eastAsia="Times New Roman"/>
+          <w:color w:val="000000"/>
+          <w:lang w:val="es-GT"/>
+        </w:rPr>
+        <w:t xml:space="preserve">3) Biochar o pirólisis: requiere equipos y control térmico específicos; se deja como alternativa para evaluar en una fase posterior.</w:t>
+      </w:r>
+      <w:r>
+        <w:rPr>
+          <w:rFonts w:eastAsia="Times New Roman"/>
+          <w:color w:val="000000"/>
+          <w:lang w:val="es-GT"/>
+        </w:rPr>
         <w:br/>
-        <w:t>4) Briquetas o pellets: requieren secado y maquinaria de densificación adicionales, además de validar compradores; se prioriza la leña seca en el piloto.</w:t>
+      </w:r>
+      <w:r>
+        <w:rPr>
+          <w:rFonts w:eastAsia="Times New Roman"/>
+          <w:color w:val="000000"/>
+          <w:lang w:val="es-GT"/>
+        </w:rPr>
+        <w:t xml:space="preserve">4) Briquetas o pellets: requieren secado y maquinaria de densificación adicionales, además de validar compradores; se prioriza la leña seca en el piloto.</w:t>
+      </w:r>
+      <w:r>
+        <w:rPr>
+          <w:rFonts w:eastAsia="Times New Roman"/>
+          <w:color w:val="000000"/>
+          <w:lang w:val="es-GT"/>
+        </w:rPr>
         <w:br/>
-        <w:t>5) Planta industrial centralizada: se descarta para el piloto por la inversión y la concentración del transporte; se propone una red de centros de menor escala.</w:t>
-        <w:br/>
-        <w:t>6) Web de intercambio directo de poda entre vecinos: se descarta como solución única porque no incorpora tratamiento ni control de calidad.</w:t>
-      </w:r>
-    </w:p>
-    <w:p>
-      <w:pPr>
-        <w:keepNext/>
+      </w:r>
+      <w:r>
+        <w:rPr>
+          <w:rFonts w:eastAsia="Times New Roman"/>
+          <w:color w:val="000000"/>
+          <w:lang w:val="es-GT"/>
+        </w:rPr>
+        <w:t xml:space="preserve">5) Planta industrial centralizada: se descarta para el piloto por la inversión y la concentración del transporte; se propone una red de centros de menor escala.</w:t>
+      </w:r>
+    </w:p>
+    <w:p>
+      <w:pPr>
+        <w:pBdr>
+          <w:left w:val="single" w:sz="4" w:space="4" w:color="000000"/>
+          <w:right w:val="single" w:sz="4" w:space="4" w:color="000000"/>
+        </w:pBdr>
+        <w:spacing w:line="240" w:lineRule="auto"/>
+        <w:rPr>
+          <w:rFonts w:ascii="Times New Roman" w:eastAsia="Times New Roman" w:hAnsi="Times New Roman" w:cs="Times New Roman"/>
+          <w:sz w:val="24"/>
+          <w:szCs w:val="24"/>
+          <w:lang w:val="es-GT"/>
+        </w:rPr>
+      </w:pPr>
+      <w:r>
+        <w:rPr>
+          <w:rFonts w:eastAsia="Times New Roman"/>
+          <w:color w:val="000000"/>
+          <w:lang w:val="es-GT"/>
+        </w:rPr>
+        <w:t xml:space="preserve">6) Sustratos formulados y enmiendas especializadas: se descartan para el piloto por su alta inversión inicial y su mantenimiento; ReVerde se limita al compost a granel y a la leña seca.</w:t>
+      </w:r>
+    </w:p>
+    <w:p>
+      <w:pPr>
+        <w:pBdr>
+          <w:left w:val="single" w:sz="4" w:space="4" w:color="000000"/>
+          <w:right w:val="single" w:sz="4" w:space="4" w:color="000000"/>
+        </w:pBdr>
+        <w:spacing w:line="240" w:lineRule="auto"/>
+        <w:rPr>
+          <w:rFonts w:ascii="Times New Roman" w:eastAsia="Times New Roman" w:hAnsi="Times New Roman" w:cs="Times New Roman"/>
+          <w:sz w:val="24"/>
+          <w:szCs w:val="24"/>
+          <w:lang w:val="es-GT"/>
+        </w:rPr>
+      </w:pPr>
+      <w:r>
+        <w:rPr>
+          <w:rFonts w:eastAsia="Times New Roman"/>
+          <w:color w:val="000000"/>
+          <w:lang w:val="es-GT"/>
+        </w:rPr>
+        <w:t xml:space="preserve">7) Restaurantes y panaderías como mercado principal de la leña: no se adopta como único mercado porque no hay evidencia local de demanda suficiente; se mantienen como compradores potenciales por validar en el piloto.</w:t>
+      </w:r>
+    </w:p>
+    <w:p>
+      <w:pPr>
+        <w:pBdr>
+          <w:left w:val="single" w:sz="4" w:space="4" w:color="000000"/>
+          <w:bottom w:val="single" w:sz="4" w:space="1" w:color="000000"/>
+          <w:right w:val="single" w:sz="4" w:space="4" w:color="000000"/>
+        </w:pBdr>
+        <w:spacing w:line="240" w:lineRule="auto"/>
+        <w:rPr>
+          <w:rFonts w:ascii="Times New Roman" w:eastAsia="Times New Roman" w:hAnsi="Times New Roman" w:cs="Times New Roman"/>
+          <w:sz w:val="24"/>
+          <w:szCs w:val="24"/>
+          <w:lang w:val="es-GT"/>
+        </w:rPr>
+      </w:pPr>
+      <w:r>
+        <w:rPr>
+          <w:rFonts w:eastAsia="Times New Roman"/>
+          <w:color w:val="000000"/>
+          <w:lang w:val="es-GT"/>
+        </w:rPr>
+        <w:t xml:space="preserve">8) Web de intercambio directo de poda entre vecinos: se descarta como solución única porque no incorpora tratamiento ni control de calidad.</w:t>
+      </w:r>
+    </w:p>
+    <w:p>
+      <w:pPr>
         <w:numPr>
           <w:ilvl w:val="0"/>
           <w:numId w:val="1"/>
@@ -822,7 +935,6 @@
     </w:p>
     <w:p>
       <w:pPr>
-        <w:keepNext/>
         <w:jc w:val="both"/>
       </w:pPr>
       <w:r>
@@ -831,457 +943,383 @@
     </w:p>
     <w:p>
       <w:pPr>
-        <w:keepLines/>
-        <w:widowControl/>
         <w:pBdr>
           <w:top w:val="single" w:sz="4" w:space="1" w:color="000000"/>
           <w:left w:val="single" w:sz="4" w:space="4" w:color="000000"/>
           <w:bottom w:val="single" w:sz="4" w:space="1" w:color="000000"/>
           <w:right w:val="single" w:sz="4" w:space="4" w:color="000000"/>
         </w:pBdr>
-        <w:spacing w:line="240" w:lineRule="auto" w:before="0" w:after="80"/>
-        <w:ind w:left="369" w:hanging="369"/>
-        <w:rPr>
-          <w:sz w:val="20"/>
-          <w:szCs w:val="20"/>
-          <w:lang w:val="en-US"/>
-        </w:rPr>
-      </w:pPr>
-      <w:r>
-        <w:rPr>
-          <w:rFonts w:ascii="Calibri" w:hAnsi="Calibri"/>
-          <w:b w:val="0"/>
-          <w:i w:val="0"/>
-          <w:color w:val="000000"/>
-          <w:sz w:val="20"/>
+        <w:ind w:left="360" w:hanging="360"/>
+        <w:rPr>
+          <w:sz w:val="20"/>
+          <w:szCs w:val="20"/>
+          <w:lang w:val="es-GT"/>
+        </w:rPr>
+      </w:pPr>
+      <w:r>
+        <w:rPr>
+          <w:sz w:val="20"/>
+          <w:szCs w:val="20"/>
+          <w:lang w:val="es-GT"/>
         </w:rPr>
         <w:t xml:space="preserve">Alessio detto Grassi, C. (2023). </w:t>
       </w:r>
       <w:r>
         <w:rPr>
-          <w:rFonts w:ascii="Calibri" w:hAnsi="Calibri"/>
-          <w:b w:val="0"/>
           <w:i/>
-          <w:color w:val="000000"/>
-          <w:sz w:val="20"/>
-        </w:rPr>
-        <w:t>Cooperative El Álamo: Informal recyclers ('waste pickers') cooperative in Buenos Aires</w:t>
-      </w:r>
-      <w:r>
-        <w:rPr>
-          <w:rFonts w:ascii="Calibri" w:hAnsi="Calibri"/>
-          <w:b w:val="0"/>
-          <w:i w:val="0"/>
-          <w:color w:val="000000"/>
-          <w:sz w:val="20"/>
+          <w:iCs/>
+          <w:sz w:val="20"/>
+          <w:szCs w:val="20"/>
+          <w:lang w:val="es-GT"/>
+        </w:rPr>
+        <w:t xml:space="preserve">Cooperative El Álamo: Informal recyclers ('waste pickers') cooperative in Buenos Aires</w:t>
+      </w:r>
+      <w:r>
+        <w:rPr>
+          <w:sz w:val="20"/>
+          <w:szCs w:val="20"/>
+          <w:lang w:val="es-GT"/>
         </w:rPr>
         <w:t xml:space="preserve">. Circle Economy. </w:t>
       </w:r>
-      <w:hyperlink r:id="rId8">
+      <w:hyperlink r:id="rId8" w:history="1">
         <w:r>
           <w:rPr>
-            <w:rFonts w:ascii="Calibri" w:hAnsi="Calibri"/>
+            <w:rStyle w:val="Hipervnculo"/>
             <w:sz w:val="20"/>
-            <w:color w:val="000000"/>
-            <w:u w:val="single"/>
+            <w:szCs w:val="20"/>
+            <w:lang w:val="es-GT"/>
           </w:rPr>
-          <w:t>https://circle-economy.com/knowledge-hub/article/7031</w:t>
+          <w:t xml:space="preserve">https://circle-economy.com/knowledge-hub/article/7031</w:t>
         </w:r>
       </w:hyperlink>
     </w:p>
     <w:p>
       <w:pPr>
-        <w:keepLines/>
-        <w:widowControl/>
         <w:pBdr>
           <w:top w:val="single" w:sz="4" w:space="1" w:color="000000"/>
           <w:left w:val="single" w:sz="4" w:space="4" w:color="000000"/>
           <w:bottom w:val="single" w:sz="4" w:space="1" w:color="000000"/>
           <w:right w:val="single" w:sz="4" w:space="4" w:color="000000"/>
         </w:pBdr>
-        <w:spacing w:line="240" w:lineRule="auto" w:before="0" w:after="80"/>
-        <w:ind w:left="369" w:hanging="369"/>
-        <w:rPr>
-          <w:sz w:val="20"/>
-          <w:szCs w:val="20"/>
-          <w:lang w:val="en-US"/>
-        </w:rPr>
-      </w:pPr>
-      <w:r>
-        <w:rPr>
-          <w:rFonts w:ascii="Calibri" w:hAnsi="Calibri"/>
-          <w:b w:val="0"/>
-          <w:i w:val="0"/>
-          <w:color w:val="000000"/>
-          <w:sz w:val="20"/>
+        <w:ind w:left="360" w:hanging="360"/>
+        <w:rPr>
+          <w:sz w:val="20"/>
+          <w:szCs w:val="20"/>
+          <w:lang w:val="es-GT"/>
+        </w:rPr>
+      </w:pPr>
+      <w:r>
+        <w:rPr>
+          <w:sz w:val="20"/>
+          <w:szCs w:val="20"/>
+          <w:lang w:val="es-GT"/>
         </w:rPr>
         <w:t xml:space="preserve">Correal, M., y Rihm, A. (2022). </w:t>
       </w:r>
       <w:r>
         <w:rPr>
-          <w:rFonts w:ascii="Calibri" w:hAnsi="Calibri"/>
-          <w:b w:val="0"/>
           <w:i/>
-          <w:color w:val="000000"/>
-          <w:sz w:val="20"/>
-        </w:rPr>
-        <w:t>Hacia la valorización de residuos sólidos en América Latina y el Caribe. Conceptos básicos, análisis de viabilidad y recomendaciones de políticas públicas</w:t>
-      </w:r>
-      <w:r>
-        <w:rPr>
-          <w:rFonts w:ascii="Calibri" w:hAnsi="Calibri"/>
-          <w:b w:val="0"/>
-          <w:i w:val="0"/>
-          <w:color w:val="000000"/>
-          <w:sz w:val="20"/>
+          <w:iCs/>
+          <w:sz w:val="20"/>
+          <w:szCs w:val="20"/>
+          <w:lang w:val="es-GT"/>
+        </w:rPr>
+        <w:t xml:space="preserve">Hacia la valorización de residuos sólidos en América Latina y el Caribe. Conceptos básicos, análisis de viabilidad y recomendaciones de políticas públicas</w:t>
+      </w:r>
+      <w:r>
+        <w:rPr>
+          <w:sz w:val="20"/>
+          <w:szCs w:val="20"/>
+          <w:lang w:val="es-GT"/>
         </w:rPr>
         <w:t xml:space="preserve"> (C. M. Pasquetti y A. Abrodos, Eds.). Banco Interamericano de Desarrollo. </w:t>
       </w:r>
-      <w:hyperlink r:id="rId9">
+      <w:hyperlink r:id="rId9" w:history="1">
         <w:r>
           <w:rPr>
-            <w:rFonts w:ascii="Calibri" w:hAnsi="Calibri"/>
+            <w:rStyle w:val="Hipervnculo"/>
             <w:sz w:val="20"/>
-            <w:color w:val="000000"/>
-            <w:u w:val="single"/>
+            <w:szCs w:val="20"/>
+            <w:lang w:val="es-GT"/>
           </w:rPr>
-          <w:t>https://doi.org/10.18235/0003971</w:t>
+          <w:t xml:space="preserve">https://doi.org/10.18235/0003971</w:t>
         </w:r>
       </w:hyperlink>
     </w:p>
     <w:p>
       <w:pPr>
-        <w:keepLines/>
-        <w:widowControl/>
         <w:pBdr>
           <w:top w:val="single" w:sz="4" w:space="1" w:color="000000"/>
           <w:left w:val="single" w:sz="4" w:space="4" w:color="000000"/>
           <w:bottom w:val="single" w:sz="4" w:space="1" w:color="000000"/>
           <w:right w:val="single" w:sz="4" w:space="4" w:color="000000"/>
         </w:pBdr>
-        <w:spacing w:line="240" w:lineRule="auto" w:before="0" w:after="80"/>
-        <w:ind w:left="369" w:hanging="369"/>
-        <w:rPr>
-          <w:sz w:val="20"/>
-          <w:szCs w:val="20"/>
-          <w:lang w:val="en-US"/>
-        </w:rPr>
-      </w:pPr>
-      <w:r>
-        <w:rPr>
-          <w:rFonts w:ascii="Calibri" w:hAnsi="Calibri"/>
-          <w:b w:val="0"/>
-          <w:i w:val="0"/>
-          <w:color w:val="000000"/>
-          <w:sz w:val="20"/>
-        </w:rPr>
-        <w:t xml:space="preserve">De Anda-Trasviña, A., García-Galindo, E., Peña-Castañón, A., Seminario-Peña, J., y Nieto-Garibay, A. (2021). </w:t>
-      </w:r>
-      <w:r>
-        <w:rPr>
-          <w:rFonts w:ascii="Calibri" w:hAnsi="Calibri"/>
-          <w:b w:val="0"/>
-          <w:i w:val="0"/>
-          <w:color w:val="000000"/>
-          <w:sz w:val="20"/>
-        </w:rPr>
-        <w:t>Residuos orgánicos: ¿basura o recurso?</w:t>
-      </w:r>
-      <w:r>
-        <w:rPr>
-          <w:rFonts w:ascii="Calibri" w:hAnsi="Calibri"/>
-          <w:b w:val="0"/>
-          <w:i w:val="0"/>
-          <w:color w:val="000000"/>
-          <w:sz w:val="20"/>
-        </w:rPr>
-        <w:t xml:space="preserve"> </w:t>
-      </w:r>
-      <w:r>
-        <w:rPr>
-          <w:rFonts w:ascii="Calibri" w:hAnsi="Calibri"/>
-          <w:b w:val="0"/>
+        <w:ind w:left="360" w:hanging="360"/>
+        <w:rPr>
+          <w:sz w:val="20"/>
+          <w:szCs w:val="20"/>
+          <w:lang w:val="es-GT"/>
+        </w:rPr>
+      </w:pPr>
+      <w:r>
+        <w:rPr>
+          <w:sz w:val="20"/>
+          <w:szCs w:val="20"/>
+          <w:lang w:val="es-GT"/>
+        </w:rPr>
+        <w:t xml:space="preserve">De Anda-Trasviña, A., García-Galindo, E., Peña-Castañón, A., Seminario-Peña, J., y Nieto-Garibay, A. (2021). Residuos orgánicos: ¿basura o recurso? </w:t>
+      </w:r>
+      <w:r>
+        <w:rPr>
           <w:i/>
-          <w:color w:val="000000"/>
-          <w:sz w:val="20"/>
-        </w:rPr>
-        <w:t>Recursos Naturales y Sociedad, 7</w:t>
-      </w:r>
-      <w:r>
-        <w:rPr>
-          <w:rFonts w:ascii="Calibri" w:hAnsi="Calibri"/>
-          <w:b w:val="0"/>
-          <w:i w:val="0"/>
-          <w:color w:val="000000"/>
-          <w:sz w:val="20"/>
+          <w:iCs/>
+          <w:sz w:val="20"/>
+          <w:szCs w:val="20"/>
+          <w:lang w:val="es-GT"/>
+        </w:rPr>
+        <w:t xml:space="preserve">Recursos Naturales y Sociedad, 7</w:t>
+      </w:r>
+      <w:r>
+        <w:rPr>
+          <w:sz w:val="20"/>
+          <w:szCs w:val="20"/>
+          <w:lang w:val="es-GT"/>
         </w:rPr>
         <w:t xml:space="preserve">(3), 19–42. </w:t>
       </w:r>
-      <w:hyperlink r:id="rId19">
+      <w:hyperlink r:id="rId19" w:history="1">
         <w:r>
           <w:rPr>
-            <w:rFonts w:ascii="Calibri" w:hAnsi="Calibri"/>
+            <w:rStyle w:val="Hipervnculo"/>
             <w:sz w:val="20"/>
-            <w:color w:val="000000"/>
-            <w:u w:val="single"/>
+            <w:szCs w:val="20"/>
+            <w:lang w:val="es-GT"/>
           </w:rPr>
-          <w:t>https://doi.org/10.18846/renaysoc.2021.07.07.03.0004</w:t>
+          <w:t xml:space="preserve">https://doi.org/10.18846/renaysoc.2021.07.07.03.0004</w:t>
         </w:r>
       </w:hyperlink>
     </w:p>
     <w:p>
       <w:pPr>
-        <w:keepLines/>
-        <w:widowControl/>
         <w:pBdr>
           <w:top w:val="single" w:sz="4" w:space="1" w:color="000000"/>
           <w:left w:val="single" w:sz="4" w:space="4" w:color="000000"/>
           <w:bottom w:val="single" w:sz="4" w:space="1" w:color="000000"/>
           <w:right w:val="single" w:sz="4" w:space="4" w:color="000000"/>
         </w:pBdr>
-        <w:spacing w:line="240" w:lineRule="auto" w:before="0" w:after="80"/>
-        <w:ind w:left="369" w:hanging="369"/>
-        <w:rPr>
-          <w:sz w:val="20"/>
-          <w:szCs w:val="20"/>
-          <w:lang w:val="en-US"/>
-        </w:rPr>
-      </w:pPr>
-      <w:r>
-        <w:rPr>
-          <w:rFonts w:ascii="Calibri" w:hAnsi="Calibri"/>
-          <w:b w:val="0"/>
-          <w:i w:val="0"/>
-          <w:color w:val="000000"/>
-          <w:sz w:val="20"/>
+        <w:ind w:left="360" w:hanging="360"/>
+        <w:rPr>
+          <w:sz w:val="20"/>
+          <w:szCs w:val="20"/>
+          <w:lang w:val="es-GT"/>
+        </w:rPr>
+      </w:pPr>
+      <w:r>
+        <w:rPr>
+          <w:sz w:val="20"/>
+          <w:szCs w:val="20"/>
+          <w:lang w:val="es-GT"/>
         </w:rPr>
         <w:t xml:space="preserve">Garrido, G. J., Pettigiani, E., Silbert Voldman, V., Mazzeo, N., y Cruz, N. (2021). </w:t>
       </w:r>
       <w:r>
         <w:rPr>
-          <w:rFonts w:ascii="Calibri" w:hAnsi="Calibri"/>
-          <w:b w:val="0"/>
           <w:i/>
-          <w:color w:val="000000"/>
-          <w:sz w:val="20"/>
-        </w:rPr>
-        <w:t>Guía para una gestión integral de residuos verdes municipales: Herramientas para planificar en el territorio</w:t>
-      </w:r>
-      <w:r>
-        <w:rPr>
-          <w:rFonts w:ascii="Calibri" w:hAnsi="Calibri"/>
-          <w:b w:val="0"/>
-          <w:i w:val="0"/>
-          <w:color w:val="000000"/>
-          <w:sz w:val="20"/>
+          <w:iCs/>
+          <w:sz w:val="20"/>
+          <w:szCs w:val="20"/>
+          <w:lang w:val="es-GT"/>
+        </w:rPr>
+        <w:t xml:space="preserve">Guía para una gestión integral de residuos verdes municipales: Herramientas para planificar en el territorio</w:t>
+      </w:r>
+      <w:r>
+        <w:rPr>
+          <w:sz w:val="20"/>
+          <w:szCs w:val="20"/>
+          <w:lang w:val="es-GT"/>
         </w:rPr>
         <w:t xml:space="preserve">. Instituto Nacional de Tecnología Industrial. </w:t>
       </w:r>
-      <w:hyperlink r:id="rId10">
+      <w:hyperlink r:id="rId10" w:history="1">
         <w:r>
           <w:rPr>
-            <w:rFonts w:ascii="Calibri" w:hAnsi="Calibri"/>
+            <w:rStyle w:val="Hipervnculo"/>
             <w:sz w:val="20"/>
-            <w:color w:val="000000"/>
-            <w:u w:val="single"/>
+            <w:szCs w:val="20"/>
+            <w:lang w:val="es-GT"/>
           </w:rPr>
-          <w:t>https://ledslac.org/wp-content/uploads/2021/07/cuadernillo-gestion-residuos-verdes_2021-1.pdf</w:t>
+          <w:t xml:space="preserve">https://ledslac.org/wp-content/uploads/2021/07/cuadernillo-gestion-residuos-verdes_2021-1.pdf</w:t>
         </w:r>
       </w:hyperlink>
     </w:p>
     <w:p>
       <w:pPr>
-        <w:keepLines/>
-        <w:widowControl/>
         <w:pBdr>
           <w:top w:val="single" w:sz="4" w:space="1" w:color="000000"/>
           <w:left w:val="single" w:sz="4" w:space="4" w:color="000000"/>
           <w:bottom w:val="single" w:sz="4" w:space="1" w:color="000000"/>
           <w:right w:val="single" w:sz="4" w:space="4" w:color="000000"/>
         </w:pBdr>
-        <w:spacing w:line="240" w:lineRule="auto" w:before="0" w:after="80"/>
-        <w:ind w:left="369" w:hanging="369"/>
-        <w:rPr>
-          <w:sz w:val="20"/>
-          <w:szCs w:val="20"/>
-          <w:lang w:val="en-US"/>
-        </w:rPr>
-      </w:pPr>
-      <w:r>
-        <w:rPr>
-          <w:rFonts w:ascii="Calibri" w:hAnsi="Calibri"/>
-          <w:b w:val="0"/>
-          <w:i w:val="0"/>
-          <w:color w:val="000000"/>
-          <w:sz w:val="20"/>
+        <w:ind w:left="360" w:hanging="360"/>
+        <w:rPr>
+          <w:sz w:val="20"/>
+          <w:szCs w:val="20"/>
+          <w:lang w:val="es-GT"/>
+        </w:rPr>
+      </w:pPr>
+      <w:r>
+        <w:rPr>
+          <w:sz w:val="20"/>
+          <w:szCs w:val="20"/>
+          <w:lang w:val="es-GT"/>
         </w:rPr>
         <w:t xml:space="preserve">Ministerio de Energía y Minas, Instituto Nacional Forestal, Ministerio del Ambiente y los Recursos Naturales, y Ministerio Agropecuario y Forestal. (2011). </w:t>
       </w:r>
       <w:r>
         <w:rPr>
-          <w:rFonts w:ascii="Calibri" w:hAnsi="Calibri"/>
-          <w:b w:val="0"/>
           <w:i/>
-          <w:color w:val="000000"/>
-          <w:sz w:val="20"/>
-        </w:rPr>
-        <w:t>Estrategia Nacional de Leña y Carbón Vegetal de Nicaragua, 2011–2021</w:t>
-      </w:r>
-      <w:r>
-        <w:rPr>
-          <w:rFonts w:ascii="Calibri" w:hAnsi="Calibri"/>
-          <w:b w:val="0"/>
-          <w:i w:val="0"/>
-          <w:color w:val="000000"/>
-          <w:sz w:val="20"/>
+          <w:iCs/>
+          <w:sz w:val="20"/>
+          <w:szCs w:val="20"/>
+          <w:lang w:val="es-GT"/>
+        </w:rPr>
+        <w:t xml:space="preserve">Estrategia Nacional de Leña y Carbón Vegetal de Nicaragua, 2011–2021</w:t>
+      </w:r>
+      <w:r>
+        <w:rPr>
+          <w:sz w:val="20"/>
+          <w:szCs w:val="20"/>
+          <w:lang w:val="es-GT"/>
         </w:rPr>
         <w:t xml:space="preserve">. Gobierno de Nicaragua. </w:t>
       </w:r>
-      <w:hyperlink r:id="rId20">
+      <w:hyperlink r:id="rId20" w:history="1">
         <w:r>
           <w:rPr>
-            <w:rFonts w:ascii="Calibri" w:hAnsi="Calibri"/>
+            <w:rStyle w:val="Hipervnculo"/>
             <w:sz w:val="20"/>
-            <w:color w:val="000000"/>
-            <w:u w:val="single"/>
+            <w:szCs w:val="20"/>
+            <w:lang w:val="es-GT"/>
           </w:rPr>
-          <w:t>https://marena.gob.ni/Enderedd/wp-content/uploads/Docs/Documentos%20Tecnicos/estrategia_lena_carbon%20en%20Nicaragua.pdf</w:t>
+          <w:t xml:space="preserve">https://marena.gob.ni/Enderedd/wp-content/uploads/Docs/Documentos%20Tecnicos/estrategia_lena_carbon%20en%20Nicaragua.pdf</w:t>
         </w:r>
       </w:hyperlink>
     </w:p>
     <w:p>
       <w:pPr>
-        <w:keepLines/>
-        <w:widowControl/>
         <w:pBdr>
           <w:top w:val="single" w:sz="4" w:space="1" w:color="000000"/>
           <w:left w:val="single" w:sz="4" w:space="4" w:color="000000"/>
           <w:bottom w:val="single" w:sz="4" w:space="1" w:color="000000"/>
           <w:right w:val="single" w:sz="4" w:space="4" w:color="000000"/>
         </w:pBdr>
-        <w:spacing w:line="240" w:lineRule="auto" w:before="0" w:after="80"/>
-        <w:ind w:left="369" w:hanging="369"/>
-        <w:rPr>
-          <w:sz w:val="20"/>
-          <w:szCs w:val="20"/>
-          <w:lang w:val="en-US"/>
-        </w:rPr>
-      </w:pPr>
-      <w:r>
-        <w:rPr>
-          <w:rFonts w:ascii="Calibri" w:hAnsi="Calibri"/>
-          <w:b w:val="0"/>
-          <w:i w:val="0"/>
-          <w:color w:val="000000"/>
-          <w:sz w:val="20"/>
+        <w:ind w:left="360" w:hanging="360"/>
+        <w:rPr>
+          <w:sz w:val="20"/>
+          <w:szCs w:val="20"/>
+          <w:lang w:val="es-GT"/>
+        </w:rPr>
+      </w:pPr>
+      <w:r>
+        <w:rPr>
+          <w:sz w:val="20"/>
+          <w:szCs w:val="20"/>
+          <w:lang w:val="es-GT"/>
         </w:rPr>
         <w:t xml:space="preserve">Proyecto Hormiga. (s. f.). </w:t>
       </w:r>
       <w:r>
         <w:rPr>
-          <w:rFonts w:ascii="Calibri" w:hAnsi="Calibri"/>
-          <w:b w:val="0"/>
           <w:i/>
-          <w:color w:val="000000"/>
-          <w:sz w:val="20"/>
-        </w:rPr>
-        <w:t>Valorización de residuos de poda urbana y biomasa vegetal</w:t>
-      </w:r>
-      <w:r>
-        <w:rPr>
-          <w:rFonts w:ascii="Calibri" w:hAnsi="Calibri"/>
-          <w:b w:val="0"/>
-          <w:i w:val="0"/>
-          <w:color w:val="000000"/>
-          <w:sz w:val="20"/>
+          <w:iCs/>
+          <w:sz w:val="20"/>
+          <w:szCs w:val="20"/>
+          <w:lang w:val="es-GT"/>
+        </w:rPr>
+        <w:t xml:space="preserve">Valorización de residuos de poda urbana y biomasa vegetal</w:t>
+      </w:r>
+      <w:r>
+        <w:rPr>
+          <w:sz w:val="20"/>
+          <w:szCs w:val="20"/>
+          <w:lang w:val="es-GT"/>
         </w:rPr>
         <w:t xml:space="preserve">. </w:t>
       </w:r>
-      <w:hyperlink r:id="rId12">
+      <w:hyperlink r:id="rId12" w:history="1">
         <w:r>
           <w:rPr>
-            <w:rFonts w:ascii="Calibri" w:hAnsi="Calibri"/>
+            <w:rStyle w:val="Hipervnculo"/>
             <w:sz w:val="20"/>
-            <w:color w:val="000000"/>
-            <w:u w:val="single"/>
+            <w:szCs w:val="20"/>
+            <w:lang w:val="es-GT"/>
           </w:rPr>
-          <w:t>https://www.proyectohormiga.com.ar/valorizacion-residuos-poda</w:t>
+          <w:t xml:space="preserve">https://www.proyectohormiga.com.ar/valorizacion-residuos-poda</w:t>
         </w:r>
       </w:hyperlink>
     </w:p>
     <w:p>
       <w:pPr>
-        <w:keepLines/>
-        <w:widowControl/>
         <w:pBdr>
           <w:top w:val="single" w:sz="4" w:space="1" w:color="000000"/>
           <w:left w:val="single" w:sz="4" w:space="4" w:color="000000"/>
           <w:bottom w:val="single" w:sz="4" w:space="1" w:color="000000"/>
           <w:right w:val="single" w:sz="4" w:space="4" w:color="000000"/>
         </w:pBdr>
-        <w:spacing w:line="240" w:lineRule="auto" w:before="0" w:after="80"/>
-        <w:ind w:left="369" w:hanging="369"/>
-        <w:rPr>
-          <w:sz w:val="20"/>
-          <w:szCs w:val="20"/>
-          <w:lang w:val="en-US"/>
-        </w:rPr>
-      </w:pPr>
-      <w:r>
-        <w:rPr>
-          <w:rFonts w:ascii="Calibri" w:hAnsi="Calibri"/>
-          <w:b w:val="0"/>
-          <w:i w:val="0"/>
-          <w:color w:val="000000"/>
-          <w:sz w:val="20"/>
+        <w:ind w:left="360" w:hanging="360"/>
+        <w:rPr>
+          <w:sz w:val="20"/>
+          <w:szCs w:val="20"/>
+          <w:lang w:val="es-GT"/>
+        </w:rPr>
+      </w:pPr>
+      <w:r>
+        <w:rPr>
+          <w:sz w:val="20"/>
+          <w:szCs w:val="20"/>
+          <w:lang w:val="es-GT"/>
         </w:rPr>
         <w:t xml:space="preserve">Silbert Voldman, V., Ringuelet, A., Herrera Bolzón, A. H., y Gaona Flores, M. A. (2025). </w:t>
       </w:r>
       <w:r>
         <w:rPr>
-          <w:rFonts w:ascii="Calibri" w:hAnsi="Calibri"/>
-          <w:b w:val="0"/>
           <w:i/>
-          <w:color w:val="000000"/>
-          <w:sz w:val="20"/>
-        </w:rPr>
-        <w:t>Guía técnica para el diseño de plantas de compostaje de poda urbana</w:t>
-      </w:r>
-      <w:r>
-        <w:rPr>
-          <w:rFonts w:ascii="Calibri" w:hAnsi="Calibri"/>
-          <w:b w:val="0"/>
-          <w:i w:val="0"/>
-          <w:color w:val="000000"/>
-          <w:sz w:val="20"/>
+          <w:iCs/>
+          <w:sz w:val="20"/>
+          <w:szCs w:val="20"/>
+          <w:lang w:val="es-GT"/>
+        </w:rPr>
+        <w:t xml:space="preserve">Guía técnica para el diseño de plantas de compostaje de poda urbana</w:t>
+      </w:r>
+      <w:r>
+        <w:rPr>
+          <w:sz w:val="20"/>
+          <w:szCs w:val="20"/>
+          <w:lang w:val="es-GT"/>
         </w:rPr>
         <w:t xml:space="preserve">. Instituto Nacional de Tecnología Industrial. </w:t>
       </w:r>
-      <w:hyperlink r:id="rId21">
+      <w:hyperlink r:id="rId21" w:history="1">
         <w:r>
           <w:rPr>
-            <w:rFonts w:ascii="Calibri" w:hAnsi="Calibri"/>
+            <w:rStyle w:val="Hipervnculo"/>
             <w:sz w:val="20"/>
-            <w:color w:val="000000"/>
-            <w:u w:val="single"/>
+            <w:szCs w:val="20"/>
+            <w:lang w:val="es-GT"/>
           </w:rPr>
-          <w:t>https://www.argentina.gob.ar/inta/ciap/guia-tecnica-para-el-diseno-de-plantas-de-compostaje-de-poda-urbana</w:t>
+          <w:t xml:space="preserve">https://www.argentina.gob.ar/inta/ciap/guia-tecnica-para-el-diseno-de-plantas-de-compostaje-de-poda-urbana</w:t>
         </w:r>
       </w:hyperlink>
     </w:p>
     <w:p>
       <w:pPr>
-        <w:keepNext/>
-        <w:keepLines/>
-        <w:pageBreakBefore/>
-        <w:widowControl/>
         <w:pBdr>
           <w:top w:val="single" w:sz="4" w:space="1" w:color="000000"/>
           <w:left w:val="single" w:sz="4" w:space="4" w:color="000000"/>
           <w:bottom w:val="single" w:sz="4" w:space="1" w:color="000000"/>
           <w:right w:val="single" w:sz="4" w:space="4" w:color="000000"/>
         </w:pBdr>
-        <w:spacing w:line="240" w:lineRule="auto" w:before="120" w:after="80"/>
         <w:ind w:left="360" w:hanging="360"/>
         <w:rPr>
           <w:sz w:val="20"/>
@@ -1289,355 +1327,326 @@
           <w:lang w:val="es-GT"/>
         </w:rPr>
       </w:pPr>
-      <w:r>
-        <w:rPr>
-          <w:rFonts w:ascii="Calibri" w:hAnsi="Calibri"/>
+      <w:proofErr w:type="gramStart"/>
+      <w:r>
+        <w:rPr>
           <w:b/>
-          <w:color w:val="000000"/>
-          <w:sz w:val="20"/>
+          <w:bCs/>
+          <w:sz w:val="20"/>
+          <w:szCs w:val="20"/>
+          <w:lang w:val="es-GT"/>
         </w:rPr>
         <w:t>Herramientas de inteligencia artificial y software</w:t>
       </w:r>
-    </w:p>
-    <w:p>
-      <w:pPr>
-        <w:keepLines/>
-        <w:widowControl/>
+      <w:proofErr w:type="gramEnd"/>
+    </w:p>
+    <w:p>
+      <w:pPr>
         <w:pBdr>
           <w:top w:val="single" w:sz="4" w:space="1" w:color="000000"/>
           <w:left w:val="single" w:sz="4" w:space="4" w:color="000000"/>
           <w:bottom w:val="single" w:sz="4" w:space="1" w:color="000000"/>
           <w:right w:val="single" w:sz="4" w:space="4" w:color="000000"/>
         </w:pBdr>
-        <w:spacing w:line="240" w:lineRule="auto" w:before="0" w:after="80"/>
-        <w:ind w:left="369" w:hanging="369"/>
-        <w:rPr>
-          <w:sz w:val="20"/>
-          <w:szCs w:val="20"/>
-          <w:lang w:val="en-US"/>
-        </w:rPr>
-      </w:pPr>
-      <w:r>
-        <w:rPr>
-          <w:rFonts w:ascii="Calibri" w:hAnsi="Calibri"/>
-          <w:b w:val="0"/>
-          <w:i w:val="0"/>
-          <w:color w:val="000000"/>
-          <w:sz w:val="20"/>
+        <w:ind w:left="360" w:hanging="360"/>
+        <w:rPr>
+          <w:sz w:val="20"/>
+          <w:szCs w:val="20"/>
+          <w:lang w:val="es-GT"/>
+        </w:rPr>
+      </w:pPr>
+      <w:r>
+        <w:rPr>
+          <w:sz w:val="20"/>
+          <w:szCs w:val="20"/>
+          <w:lang w:val="es-GT"/>
         </w:rPr>
         <w:t xml:space="preserve">Anthropic. (2026). </w:t>
       </w:r>
       <w:r>
         <w:rPr>
-          <w:rFonts w:ascii="Calibri" w:hAnsi="Calibri"/>
-          <w:b w:val="0"/>
           <w:i/>
-          <w:color w:val="000000"/>
-          <w:sz w:val="20"/>
-        </w:rPr>
-        <w:t>Claude (versión Opus 5.5)</w:t>
-      </w:r>
-      <w:r>
-        <w:rPr>
-          <w:rFonts w:ascii="Calibri" w:hAnsi="Calibri"/>
-          <w:b w:val="0"/>
-          <w:i w:val="0"/>
-          <w:color w:val="000000"/>
-          <w:sz w:val="20"/>
-        </w:rPr>
-        <w:t xml:space="preserve"> [Modelo de lenguaje]. </w:t>
-      </w:r>
-      <w:hyperlink r:id="rId22">
+          <w:iCs/>
+          <w:sz w:val="20"/>
+          <w:szCs w:val="20"/>
+          <w:lang w:val="es-GT"/>
+        </w:rPr>
+        <w:t xml:space="preserve">Claude (versión Opus 5.5)</w:t>
+      </w:r>
+      <w:r>
+        <w:rPr>
+          <w:sz w:val="20"/>
+          <w:szCs w:val="20"/>
+          <w:lang w:val="es-GT"/>
+        </w:rPr>
+        <w:t xml:space="preserve"> [Modelo de lenguaje de gran tamaño]. </w:t>
+      </w:r>
+      <w:hyperlink r:id="rId13" w:history="1">
         <w:r>
           <w:rPr>
-            <w:rFonts w:ascii="Calibri" w:hAnsi="Calibri"/>
+            <w:rStyle w:val="Hipervnculo"/>
             <w:sz w:val="20"/>
-            <w:color w:val="000000"/>
-            <w:u w:val="single"/>
+            <w:szCs w:val="20"/>
+            <w:lang w:val="es-GT"/>
           </w:rPr>
-          <w:t>https://www.anthropic.com/claude-opus-5-5</w:t>
+          <w:t xml:space="preserve">https://claude.ai</w:t>
         </w:r>
       </w:hyperlink>
-    </w:p>
-    <w:p>
-      <w:pPr>
-        <w:keepLines/>
-        <w:widowControl/>
+      <w:r>
+        <w:rPr>
+          <w:sz w:val="20"/>
+          <w:szCs w:val="20"/>
+          <w:lang w:val="es-GT"/>
+        </w:rPr>
+        <w:t xml:space="preserve">. Asistente de IA usado el 16 y 17/10/2026 para buscar páginas y documentos de referencia, que el equipo filtró y revisó, y para el código base de la maqueta web, que el equipo revisó y editó.</w:t>
+      </w:r>
+    </w:p>
+    <w:p>
+      <w:pPr>
         <w:pBdr>
           <w:top w:val="single" w:sz="4" w:space="1" w:color="000000"/>
           <w:left w:val="single" w:sz="4" w:space="4" w:color="000000"/>
           <w:bottom w:val="single" w:sz="4" w:space="1" w:color="000000"/>
           <w:right w:val="single" w:sz="4" w:space="4" w:color="000000"/>
         </w:pBdr>
-        <w:spacing w:line="240" w:lineRule="auto" w:before="0" w:after="80"/>
-        <w:ind w:left="369" w:hanging="369"/>
-        <w:rPr>
-          <w:sz w:val="20"/>
-          <w:szCs w:val="20"/>
-          <w:lang w:val="en-US"/>
-        </w:rPr>
-      </w:pPr>
-      <w:r>
-        <w:rPr>
-          <w:rFonts w:ascii="Calibri" w:hAnsi="Calibri"/>
-          <w:b w:val="0"/>
-          <w:i w:val="0"/>
-          <w:color w:val="000000"/>
-          <w:sz w:val="20"/>
+        <w:ind w:left="360" w:hanging="360"/>
+        <w:rPr>
+          <w:sz w:val="20"/>
+          <w:szCs w:val="20"/>
+          <w:lang w:val="es-GT"/>
+        </w:rPr>
+      </w:pPr>
+      <w:r>
+        <w:rPr>
+          <w:sz w:val="20"/>
+          <w:szCs w:val="20"/>
+          <w:lang w:val="es-GT"/>
         </w:rPr>
         <w:t xml:space="preserve">Blender Foundation. (2025). </w:t>
       </w:r>
       <w:r>
         <w:rPr>
-          <w:rFonts w:ascii="Calibri" w:hAnsi="Calibri"/>
-          <w:b w:val="0"/>
           <w:i/>
-          <w:color w:val="000000"/>
-          <w:sz w:val="20"/>
-        </w:rPr>
-        <w:t>Blender (versión 4.5.3 LTS)</w:t>
-      </w:r>
-      <w:r>
-        <w:rPr>
-          <w:rFonts w:ascii="Calibri" w:hAnsi="Calibri"/>
-          <w:b w:val="0"/>
-          <w:i w:val="0"/>
-          <w:color w:val="000000"/>
-          <w:sz w:val="20"/>
+          <w:iCs/>
+          <w:sz w:val="20"/>
+          <w:szCs w:val="20"/>
+          <w:lang w:val="es-GT"/>
+        </w:rPr>
+        <w:t xml:space="preserve">Blender (versión 4.5.3 LTS)</w:t>
+      </w:r>
+      <w:r>
+        <w:rPr>
+          <w:sz w:val="20"/>
+          <w:szCs w:val="20"/>
+          <w:lang w:val="es-GT"/>
         </w:rPr>
         <w:t xml:space="preserve"> [Software de modelado y animación 3D]. </w:t>
       </w:r>
-      <w:hyperlink r:id="rId23">
+      <w:hyperlink r:id="rId22" w:history="1">
         <w:r>
           <w:rPr>
-            <w:rFonts w:ascii="Calibri" w:hAnsi="Calibri"/>
+            <w:rStyle w:val="Hipervnculo"/>
             <w:sz w:val="20"/>
-            <w:color w:val="000000"/>
-            <w:u w:val="single"/>
+            <w:szCs w:val="20"/>
+            <w:lang w:val="es-GT"/>
           </w:rPr>
-          <w:t>https://www.blender.org/releases/4-5/</w:t>
+          <w:t xml:space="preserve">https://www.blender.org/releases/4-5/</w:t>
         </w:r>
       </w:hyperlink>
-    </w:p>
-    <w:p>
-      <w:pPr>
-        <w:keepLines/>
-        <w:widowControl/>
+      <w:r>
+        <w:rPr>
+          <w:sz w:val="20"/>
+          <w:szCs w:val="20"/>
+          <w:lang w:val="es-GT"/>
+        </w:rPr>
+        <w:t xml:space="preserve">. Software usado para generar y renderizar el modelo 3D conceptual.</w:t>
+      </w:r>
+    </w:p>
+    <w:p>
+      <w:pPr>
         <w:pBdr>
           <w:top w:val="single" w:sz="4" w:space="1" w:color="000000"/>
           <w:left w:val="single" w:sz="4" w:space="4" w:color="000000"/>
           <w:bottom w:val="single" w:sz="4" w:space="1" w:color="000000"/>
           <w:right w:val="single" w:sz="4" w:space="4" w:color="000000"/>
         </w:pBdr>
-        <w:spacing w:line="240" w:lineRule="auto" w:before="0" w:after="80"/>
-        <w:ind w:left="369" w:hanging="369"/>
-        <w:rPr>
-          <w:sz w:val="20"/>
-          <w:szCs w:val="20"/>
-          <w:lang w:val="en-US"/>
-        </w:rPr>
-      </w:pPr>
-      <w:r>
-        <w:rPr>
-          <w:rFonts w:ascii="Calibri" w:hAnsi="Calibri"/>
-          <w:b w:val="0"/>
-          <w:i w:val="0"/>
-          <w:color w:val="000000"/>
-          <w:sz w:val="20"/>
+        <w:ind w:left="360" w:hanging="360"/>
+        <w:rPr>
+          <w:sz w:val="20"/>
+          <w:szCs w:val="20"/>
+          <w:lang w:val="es-GT"/>
+        </w:rPr>
+      </w:pPr>
+      <w:r>
+        <w:rPr>
+          <w:sz w:val="20"/>
+          <w:szCs w:val="20"/>
+          <w:lang w:val="es-GT"/>
         </w:rPr>
         <w:t xml:space="preserve">Google. (2026). </w:t>
       </w:r>
       <w:r>
         <w:rPr>
-          <w:rFonts w:ascii="Calibri" w:hAnsi="Calibri"/>
-          <w:b w:val="0"/>
           <w:i/>
-          <w:color w:val="000000"/>
-          <w:sz w:val="20"/>
-        </w:rPr>
-        <w:t>Gemini (versión 3.8 Flash)</w:t>
-      </w:r>
-      <w:r>
-        <w:rPr>
-          <w:rFonts w:ascii="Calibri" w:hAnsi="Calibri"/>
-          <w:b w:val="0"/>
-          <w:i w:val="0"/>
-          <w:color w:val="000000"/>
-          <w:sz w:val="20"/>
-        </w:rPr>
-        <w:t xml:space="preserve"> [Modelo de lenguaje]. </w:t>
-      </w:r>
-      <w:hyperlink r:id="rId24">
+          <w:iCs/>
+          <w:sz w:val="20"/>
+          <w:szCs w:val="20"/>
+          <w:lang w:val="es-GT"/>
+        </w:rPr>
+        <w:t xml:space="preserve">Gemini (versión 3.8 Flash)</w:t>
+      </w:r>
+      <w:r>
+        <w:rPr>
+          <w:sz w:val="20"/>
+          <w:szCs w:val="20"/>
+          <w:lang w:val="es-GT"/>
+        </w:rPr>
+        <w:t xml:space="preserve"> [Modelo de lenguaje de gran tamaño]. </w:t>
+      </w:r>
+      <w:hyperlink r:id="rId15" w:history="1">
         <w:r>
           <w:rPr>
-            <w:rFonts w:ascii="Calibri" w:hAnsi="Calibri"/>
+            <w:rStyle w:val="Hipervnculo"/>
             <w:sz w:val="20"/>
-            <w:color w:val="000000"/>
-            <w:u w:val="single"/>
+            <w:szCs w:val="20"/>
+            <w:lang w:val="es-GT"/>
           </w:rPr>
-          <w:t>https://ai.google.dev/gemini-api/docs/models</w:t>
+          <w:t xml:space="preserve">https://gemini.google.com</w:t>
         </w:r>
       </w:hyperlink>
-    </w:p>
-    <w:p>
-      <w:pPr>
-        <w:keepLines/>
-        <w:widowControl/>
+      <w:r>
+        <w:rPr>
+          <w:sz w:val="20"/>
+          <w:szCs w:val="20"/>
+          <w:lang w:val="es-GT"/>
+        </w:rPr>
+        <w:t xml:space="preserve">. Asistente de IA usado el 16 y 17/10/2026 para elaborar un listado aproximado de inversión, base de una cotización aproximada; buscar páginas y documentos de referencia, que el equipo filtró; y comparar propuestas.</w:t>
+      </w:r>
+    </w:p>
+    <w:p>
+      <w:pPr>
         <w:pBdr>
           <w:top w:val="single" w:sz="4" w:space="1" w:color="000000"/>
           <w:left w:val="single" w:sz="4" w:space="4" w:color="000000"/>
           <w:bottom w:val="single" w:sz="4" w:space="1" w:color="000000"/>
           <w:right w:val="single" w:sz="4" w:space="4" w:color="000000"/>
         </w:pBdr>
-        <w:spacing w:line="240" w:lineRule="auto" w:before="0" w:after="80"/>
-        <w:ind w:left="369" w:hanging="369"/>
-        <w:rPr>
-          <w:sz w:val="20"/>
-          <w:szCs w:val="20"/>
-          <w:lang w:val="en-US"/>
-        </w:rPr>
-      </w:pPr>
-      <w:r>
-        <w:rPr>
-          <w:rFonts w:ascii="Calibri" w:hAnsi="Calibri"/>
-          <w:b w:val="0"/>
-          <w:i w:val="0"/>
-          <w:color w:val="000000"/>
-          <w:sz w:val="20"/>
-        </w:rPr>
-        <w:t xml:space="preserve">OpenAI. (2024). </w:t>
-      </w:r>
-      <w:r>
-        <w:rPr>
-          <w:rFonts w:ascii="Calibri" w:hAnsi="Calibri"/>
-          <w:b w:val="0"/>
+        <w:ind w:left="360" w:hanging="360"/>
+        <w:rPr>
+          <w:sz w:val="20"/>
+          <w:szCs w:val="20"/>
+          <w:lang w:val="es-GT"/>
+        </w:rPr>
+      </w:pPr>
+      <w:r>
+        <w:rPr>
+          <w:sz w:val="20"/>
+          <w:szCs w:val="20"/>
+          <w:lang w:val="es-GT"/>
+        </w:rPr>
+        <w:t xml:space="preserve">OpenAI. (2025). </w:t>
+      </w:r>
+      <w:r>
+        <w:rPr>
           <w:i/>
-          <w:color w:val="000000"/>
-          <w:sz w:val="20"/>
-        </w:rPr>
-        <w:t>ChatGPT (versión GPT-4o mini)</w:t>
-      </w:r>
-      <w:r>
-        <w:rPr>
-          <w:rFonts w:ascii="Calibri" w:hAnsi="Calibri"/>
-          <w:b w:val="0"/>
-          <w:i w:val="0"/>
-          <w:color w:val="000000"/>
-          <w:sz w:val="20"/>
-        </w:rPr>
-        <w:t xml:space="preserve"> [Modelo de lenguaje]. </w:t>
-      </w:r>
-      <w:hyperlink r:id="rId25">
+          <w:iCs/>
+          <w:sz w:val="20"/>
+          <w:szCs w:val="20"/>
+          <w:lang w:val="es-GT"/>
+        </w:rPr>
+        <w:t xml:space="preserve">ChatGPT (versión GPT-4o mini)</w:t>
+      </w:r>
+      <w:r>
+        <w:rPr>
+          <w:sz w:val="20"/>
+          <w:szCs w:val="20"/>
+          <w:lang w:val="es-GT"/>
+        </w:rPr>
+        <w:t xml:space="preserve"> [Modelo de lenguaje de gran tamaño]. </w:t>
+      </w:r>
+      <w:hyperlink r:id="rId14" w:history="1">
         <w:r>
           <w:rPr>
-            <w:rFonts w:ascii="Calibri" w:hAnsi="Calibri"/>
+            <w:rStyle w:val="Hipervnculo"/>
             <w:sz w:val="20"/>
-            <w:color w:val="000000"/>
-            <w:u w:val="single"/>
+            <w:szCs w:val="20"/>
+            <w:lang w:val="es-GT"/>
           </w:rPr>
-          <w:t>https://openai.com/index/gpt-4o-mini-advancing-cost-efficient-intelligence/</w:t>
+          <w:t xml:space="preserve">https://openai.com/</w:t>
         </w:r>
       </w:hyperlink>
-    </w:p>
-    <w:p>
-      <w:pPr>
-        <w:keepLines/>
-        <w:widowControl/>
+      <w:r>
+        <w:rPr>
+          <w:sz w:val="20"/>
+          <w:szCs w:val="20"/>
+          <w:lang w:val="es-GT"/>
+        </w:rPr>
+        <w:t xml:space="preserve">. Asistente de IA usado el 16 y 17/10/2026 para elaborar una matriz de comparación y selección entre listados de inversión.</w:t>
+      </w:r>
+    </w:p>
+    <w:p>
+      <w:pPr>
         <w:pBdr>
           <w:top w:val="single" w:sz="4" w:space="1" w:color="000000"/>
           <w:left w:val="single" w:sz="4" w:space="4" w:color="000000"/>
           <w:bottom w:val="single" w:sz="4" w:space="1" w:color="000000"/>
           <w:right w:val="single" w:sz="4" w:space="4" w:color="000000"/>
         </w:pBdr>
-        <w:spacing w:line="240" w:lineRule="auto" w:before="0" w:after="80"/>
-        <w:ind w:left="369" w:hanging="369"/>
-        <w:rPr>
-          <w:sz w:val="20"/>
-          <w:szCs w:val="20"/>
-          <w:lang w:val="en-US"/>
-        </w:rPr>
-      </w:pPr>
-      <w:r>
-        <w:rPr>
-          <w:rFonts w:ascii="Calibri" w:hAnsi="Calibri"/>
-          <w:b w:val="0"/>
-          <w:i w:val="0"/>
-          <w:color w:val="000000"/>
-          <w:sz w:val="20"/>
+        <w:ind w:left="360" w:hanging="360"/>
+        <w:rPr>
+          <w:sz w:val="20"/>
+          <w:szCs w:val="20"/>
+          <w:lang w:val="es-GT"/>
+        </w:rPr>
+      </w:pPr>
+      <w:r>
+        <w:rPr>
+          <w:sz w:val="20"/>
+          <w:szCs w:val="20"/>
+          <w:lang w:val="es-GT"/>
         </w:rPr>
         <w:t xml:space="preserve">OpenAI. (2026). </w:t>
       </w:r>
       <w:r>
         <w:rPr>
-          <w:rFonts w:ascii="Calibri" w:hAnsi="Calibri"/>
-          <w:b w:val="0"/>
           <w:i/>
-          <w:color w:val="000000"/>
-          <w:sz w:val="20"/>
-        </w:rPr>
-        <w:t>Codex</w:t>
-      </w:r>
-      <w:r>
-        <w:rPr>
-          <w:rFonts w:ascii="Calibri" w:hAnsi="Calibri"/>
-          <w:b w:val="0"/>
-          <w:i w:val="0"/>
-          <w:color w:val="000000"/>
-          <w:sz w:val="20"/>
+          <w:iCs/>
+          <w:sz w:val="20"/>
+          <w:szCs w:val="20"/>
+          <w:lang w:val="es-GT"/>
+        </w:rPr>
+        <w:t xml:space="preserve">Codex</w:t>
+      </w:r>
+      <w:r>
+        <w:rPr>
+          <w:sz w:val="20"/>
+          <w:szCs w:val="20"/>
+          <w:lang w:val="es-GT"/>
         </w:rPr>
         <w:t xml:space="preserve"> [Asistente de inteligencia artificial]. </w:t>
       </w:r>
-      <w:hyperlink r:id="rId26">
+      <w:hyperlink r:id="rId23" w:history="1">
         <w:r>
           <w:rPr>
-            <w:rFonts w:ascii="Calibri" w:hAnsi="Calibri"/>
+            <w:rStyle w:val="Hipervnculo"/>
             <w:sz w:val="20"/>
-            <w:color w:val="000000"/>
-            <w:u w:val="single"/>
+            <w:szCs w:val="20"/>
+            <w:lang w:val="es-GT"/>
           </w:rPr>
-          <w:t>https://openai.com/codex/</w:t>
+          <w:t xml:space="preserve">https://openai.com/codex/</w:t>
         </w:r>
       </w:hyperlink>
-    </w:p>
-    <w:p>
-      <w:pPr>
-        <w:keepLines w:val="0"/>
-        <w:widowControl/>
-        <w:pBdr>
-          <w:top w:val="single" w:sz="4" w:space="1" w:color="000000"/>
-          <w:left w:val="single" w:sz="4" w:space="4" w:color="000000"/>
-          <w:bottom w:val="single" w:sz="4" w:space="1" w:color="000000"/>
-          <w:right w:val="single" w:sz="4" w:space="4" w:color="000000"/>
-        </w:pBdr>
-        <w:spacing w:line="240" w:lineRule="auto" w:before="0" w:after="80"/>
-        <w:ind w:left="360" w:hanging="360"/>
-        <w:rPr>
-          <w:sz w:val="20"/>
-          <w:szCs w:val="20"/>
-          <w:lang w:val="en-US"/>
-        </w:rPr>
-      </w:pPr>
-      <w:r>
-        <w:rPr>
-          <w:rFonts w:ascii="Calibri" w:hAnsi="Calibri"/>
-          <w:b/>
-          <w:i w:val="0"/>
-          <w:color w:val="000000"/>
-          <w:sz w:val="20"/>
-        </w:rPr>
-        <w:t xml:space="preserve">Uso declarado los días 16 y 17 de octubre de 2026. </w:t>
-      </w:r>
-      <w:r>
-        <w:rPr>
-          <w:rFonts w:ascii="Calibri" w:hAnsi="Calibri"/>
-          <w:b w:val="0"/>
-          <w:i w:val="0"/>
-          <w:color w:val="000000"/>
-          <w:sz w:val="20"/>
-        </w:rPr>
-        <w:t>Claude apoyó la búsqueda de referencias y el código base de la maqueta web; ChatGPT, la comparación de inversiones; y Gemini, las estimaciones de costos, la búsqueda de fuentes y la comparación de propuestas. Codex apoyó la revisión de textos, citas y cálculos documentados, la edición de la maqueta, la generación del modelo 3D mediante código en Blender y la producción de videos demostrativos. Los costos generados con IA son estimaciones, no cotizaciones de proveedores. El equipo revisó las fuentes y el contenido. El modelo 3D es conceptual; no constituye un diseño constructivo validado.</w:t>
-      </w:r>
-    </w:p>
+      <w:r>
+        <w:rPr>
+          <w:sz w:val="20"/>
+          <w:szCs w:val="20"/>
+          <w:lang w:val="es-GT"/>
+        </w:rPr>
+        <w:t xml:space="preserve">. Asistente de IA usado el 16 y 17/10/2026 para revisar textos, citas y cálculos documentados, editar la maqueta web, generar el modelo 3D conceptual mediante código en Blender y producir videos demostrativos; el equipo revisó los resultados.</w:t>
+      </w:r>
+    </w:p>
+    <w:p/>
+    <w:p/>
     <w:sectPr>
       <w:headerReference w:type="default" r:id="rId16"/>
       <w:pgSz w:w="11906" w:h="16838"/>

</xml_diff>

<commit_message>
Aplicar solo las correcciones indicadas respetando limites de caracteres
Co-Authored-By: Claude Sonnet 5.5 <noreply@anthropic.com>
Claude-Session: https://claude.ai/code/session_017gE6Pwq5b5gtjDGsqy7MmM
</commit_message>
<xml_diff>
--- a/ACME_ULSA-Nic_RallyLatam2026_corregido.docx
+++ b/ACME_ULSA-Nic_RallyLatam2026_corregido.docx
@@ -261,7 +261,7 @@
           <w:sz w:val="20"/>
           <w:szCs w:val="20"/>
         </w:rPr>
-        <w:t xml:space="preserve">La poda urbana puede convertirse en un problema ambiental, económico y logístico cuando falta coordinación para separarla, tratarla y comercializarla. Existen experiencias de aprovechamiento, como Proyecto Hormiga en Argentina (Silbert Voldman et al., 2025). En América Latina y el Caribe, el 52 % de los residuos urbanos es orgánico; del total de residuos urbanos, cerca del 1 % se trata por compostaje, digestión o incineración y el 26,8 % termina en botaderos a cielo abierto (Correal y Rihm, 2022). Los residuos verdes representan entre el 6 % y el 60 % de la basura municipal en los casos recopilados por Garrido et al. (2021); este rango no es una medición de León. En Nicaragua, la estrategia de 2011 señalaba que casi toda la leña provenía de bosques naturales (Ministerio de Energía y Minas et al., 2011). ReVerde aborda la desconexión entre quienes generan poda, quienes la transportan y quienes pueden aprovecharla. Su separación y tratamiento permitirían recuperar materia orgánica útil para los suelos (De Anda-Trasviña et al., 2021).</w:t>
+        <w:t xml:space="preserve">Actualmente son pocas las experiencias de centros urbanos especializados en recibir y aprovechar los residuos de poda; una de ellas es Proyecto Hormiga, en Argentina (Silbert Voldman et al., 2025). Así, esta materia prima potencialmente valiosa puede convertirse en un problema ambiental, económico y logístico para ciudades de Latinoamérica. En América Latina y el Caribe el 52 % de los residuos urbanos es orgánico, incluida la poda de calles, parques y jardines; solo cerca del 1 % se trata por compostaje, digestión o incineración y el 26,8 % termina en botaderos a cielo abierto (Correal y Rihm, 2022). Los residuos verdes pesan entre el 6 % y el 60 % de la basura municipal, según los casos recopilados por Garrido et al. (2021), no una medición de León. En Nicaragua, la estrategia de 2011 señalaba que la leña provenía casi toda de bosques naturales (Ministerio de Energía y Minas et al., 2011). La poda llega mezclada y dispersa, y pocas veces se separa o se conecta con quienes compran abono y leña. El verdadero problema no es qué hacer con la poda, sino que la ciudad rompe el ciclo local de la materia orgánica: la exporta a un vertedero o la convierte en humo, mientras sus suelos pueden aprovecharla (De Anda-Trasviña et al., 2021).</w:t>
       </w:r>
     </w:p>
     <w:p>
@@ -344,7 +344,7 @@
           <w:sz w:val="20"/>
           <w:szCs w:val="20"/>
         </w:rPr>
-        <w:t xml:space="preserve">ReVerde propone centros de acopio y tratamiento distribuidos en la ciudad para recibir residuos limpios de poda y jardinería. Las hojas y ramas delgadas se destinarán al compostaje y los troncos, a leña seca. Los vecinos podrán llevar su poda o solicitar su recogida a transportistas independientes. El abono y la leña se venderán según disponibilidad; los vecinos también podrán canjear puntos por abono, conforme al programa de incentivos.</w:t>
+        <w:t xml:space="preserve">Centros de acopio distribuidos en la ciudad, donde se podrán llevar los residuos de poda urbanos.  Estos centros tendrán la capacidad de clasificar en leña y residuos, hojas y ramas pequeñas, para compostaje y tratarlos según su utilidad. La comunidad puede depositar poda y residuos de jardinería limpios, sin alimentos ni otros residuos, en el centro de acopio, así como comprar abono y leña o canjear puntos por abono, según la disponibilidad. Como alternativa, se propone una alianza con trabajadores independientes que den servicios de transporte desde el lugar de poda al centro de acopio y distribuir el producto del centro de acopio hacia los compradores. </w:t>
       </w:r>
     </w:p>
     <w:p>
@@ -366,7 +366,7 @@
           <w:sz w:val="20"/>
           <w:szCs w:val="20"/>
         </w:rPr>
-        <w:t xml:space="preserve">Los centros utilizarán trituradoras comerciales con motor eléctrico, buscando reducir costos de operación; una minicargadora para voltear las pilas de compost y una zaranda para separar el abono fino. Los troncos se cortarán con motosierra, se rajarán y se secarán bajo techo. La calidad se controlará con termómetros, medidores de humedad y análisis de laboratorio. La implementación requerirá terreno, suministro eléctrico adecuado, drenajes y convenios de abastecimiento.</w:t>
+        <w:t xml:space="preserve">Los centros utilizarán trituradoras comerciales con motor eléctrico, buscando reducir los costos de operación; una minicargadora para voltear las pilas de compost y una zaranda para separar el abono fino. Los troncos se cortarán con motosierra y se secarán bajo techo. La calidad se controlará con termómetros, medidores de humedad y análisis de laboratorio.</w:t>
       </w:r>
     </w:p>
     <w:p>
@@ -388,7 +388,7 @@
           <w:sz w:val="20"/>
           <w:szCs w:val="20"/>
         </w:rPr>
-        <w:t xml:space="preserve">Una aplicación web progresiva (PWA), accesible desde el navegador e instalable en el celular, conectará a ciudadanos, centros, transportistas y compradores para coordinar recogidas, entregas y ventas.</w:t>
+        <w:t xml:space="preserve">Para conectar a ciudadanos, centros de acopio, transportistas y compradores, se desarrollará una aplicación web progresiva (PWA), accesible desde el navegador e instalable en el celular.</w:t>
       </w:r>
     </w:p>
     <w:p>
@@ -462,7 +462,7 @@
           <w:sz w:val="20"/>
           <w:szCs w:val="20"/>
         </w:rPr>
-        <w:t xml:space="preserve">Los centros de acopio podrían generar empleo para operarios y oportunidades de ingreso para transportistas locales. La cooperativa El Álamo de Buenos Aires ofrece un antecedente de inclusión laboral en el reciclaje, aunque no de tratamiento de poda (Alessio detto Grassi, 2023). Transformar hojas y ramas en compost busca reducir la quema y el envío de poda a vertederos; aprovechar los troncos como leña seca podría sustituir parte de la madera extraída de bosques. Como referencia externa, Proyecto Hormiga (s. f.) informa haber evitado 666,25 t de CO₂ equivalente mediante su gestión de residuos de poda; no es un resultado de ReVerde. La plataforma facilitará la coordinación entre generadores, transportistas, centros y compradores, y los incentivos promoverán la entrega de poda limpia. En el piloto se medirán toneladas recibidas y aprovechadas, empleos e ingresos generados y beneficios ambientales.</w:t>
+        <w:t xml:space="preserve">La creación de centros de acopio podría contribuir a generar oportunidades económicas en la ciudad al incorporar transportistas independientes y operarios en el centro, lo que crearía fuentes de ingresos y fortalecería los servicios locales, como sucedió en la cooperativa El Álamo de Buenos Aires (Alessio detto Grassi, 2023). Al transformar la biomasa en leña y compost, se reduciría la disposición inadecuada de estos y la contaminación causada por su quema. Como referencia externa, Proyecto Hormiga (s. f.) informa haber evitado 666,25 t de CO₂ equivalente con su gestión de residuos mediante compostaje aeróbico; no es un resultado de ReVerde. La plataforma digital facilitaría la coordinación entre abastecedores, centros de acopio y compradores. Así, la iniciativa impulsaría una economía circular que generaría valor a partir de recursos desaprovechados y favorecería la conservación de los recursos naturales al disminuir la dependencia de materias primas provenientes de bosques.</w:t>
       </w:r>
     </w:p>
     <w:p>
@@ -535,7 +535,7 @@
           <w:sz w:val="20"/>
           <w:szCs w:val="20"/>
         </w:rPr>
-        <w:t xml:space="preserve">La innovación de ReVerde consiste en integrar centros de acopio, ciudadanos, transportistas independientes y compradores en una plataforma. La app coordinará la recogida de poda y la venta de abono y leña, buscando aprovechar los viajes de regreso para entregar productos. Cada lote tendrá un código QR para consultar su origen y procesamiento. El registro de horas de uso y toneladas trituradas ayudará a programar el mantenimiento y reducir interrupciones como las que, por fallas de maquinaria y de abastecimiento, llevaron a la cooperativa que en 2022 desarrolló Siempremonte a dejar de producir enmiendas y sustratos en 2023 (Silbert Voldman et al., 2025). ReVerde combina tratamiento, logística, comercialización y seguimiento en un modelo adaptable a otras ciudades de Latinoamérica.</w:t>
+        <w:t xml:space="preserve">La innovación de ReVerde consiste en conectar una red de centros de acopio con ciudadanos, transportistas independientes y compradores mediante una sola plataforma. La app coordinará la recogida de poda y la venta de abono y leña, aprovechando el viaje de regreso de los transportistas para entregar los productos. Cada lote tendrá un código QR que permitirá consultar su origen y cómo fue procesado. Además, el registro de horas de uso y toneladas trituradas ayudará a programar el mantenimiento de las máquinas y prevenir interrupciones como las que, por fallas de maquinaria y de abastecimiento, llevaron a la cooperativa que en 2022 desarrolló Siempremonte a dejar de producir enmiendas y sustratos en 2023 (Silbert Voldman et al., 2025). Así, ReVerde integra el aprovechamiento de la poda con su transporte, comercialización y seguimiento, en un modelo adaptable a otras ciudades de Latinoamérica.</w:t>
       </w:r>
     </w:p>
     <w:p>
@@ -763,7 +763,7 @@
           <w:color w:val="000000"/>
           <w:lang w:val="es-GT"/>
         </w:rPr>
-        <w:t xml:space="preserve">1) Quema de poda sin aprovechamiento: se descarta porque desperdicia el material y genera humo y riesgo de incendio.</w:t>
+        <w:t xml:space="preserve">1) Quema controlada de poda: descartada por la contaminación del aire, el riesgo de incendio y porque desperdicia el valor orgánico.</w:t>
       </w:r>
       <w:r>
         <w:rPr>
@@ -779,7 +779,7 @@
           <w:color w:val="000000"/>
           <w:lang w:val="es-GT"/>
         </w:rPr>
-        <w:t xml:space="preserve">2) Biodigestor y biogás: no se selecciona para el piloto porque los residuos verdes no son convenientes como insumo único; su uso requeriría evaluar mezclas con otras materias primas (Garrido et al., 2021).</w:t>
+        <w:t xml:space="preserve">2) Biodigestor y biogás: costo y complejidad altos para un municipio con recursos limitados, y la poda leñosa se degrada lentamente en estos sistemas.</w:t>
       </w:r>
       <w:r>
         <w:rPr>
@@ -795,7 +795,7 @@
           <w:color w:val="000000"/>
           <w:lang w:val="es-GT"/>
         </w:rPr>
-        <w:t xml:space="preserve">3) Biochar o pirólisis: requiere equipos y control térmico específicos; se deja como alternativa para evaluar en una fase posterior.</w:t>
+        <w:t xml:space="preserve">3) Biochar o pirólisis: requiere equipo y control de temperatura; lo dejamos como posible fase 2.</w:t>
       </w:r>
       <w:r>
         <w:rPr>
@@ -811,7 +811,7 @@
           <w:color w:val="000000"/>
           <w:lang w:val="es-GT"/>
         </w:rPr>
-        <w:t xml:space="preserve">4) Briquetas o pellets: requieren secado y maquinaria de densificación adicionales, además de validar compradores; se prioriza la leña seca en el piloto.</w:t>
+        <w:t xml:space="preserve">4) Briquetas o pellets para energía: exige secado, maquinaria y validar un mercado; se prioriza la leña seca.</w:t>
       </w:r>
       <w:r>
         <w:rPr>
@@ -827,7 +827,7 @@
           <w:color w:val="000000"/>
           <w:lang w:val="es-GT"/>
         </w:rPr>
-        <w:t xml:space="preserve">5) Planta industrial centralizada: se descarta para el piloto por la inversión y la concentración del transporte; se propone una red de centros de menor escala.</w:t>
+        <w:t xml:space="preserve">5) Planta centralizada de compostaje industrial: inversión alta y mayor transporte; preferimos un modelo pequeño y replicable.</w:t>
       </w:r>
     </w:p>
     <w:p>
@@ -850,7 +850,7 @@
           <w:color w:val="000000"/>
           <w:lang w:val="es-GT"/>
         </w:rPr>
-        <w:t xml:space="preserve">6) Sustratos formulados y enmiendas especializadas: se descartan para el piloto por su alta inversión inicial y su mantenimiento; ReVerde se limita al compost a granel y a la leña seca.</w:t>
+        <w:t xml:space="preserve">6) Producción de sustratos formulados (tierra preparada para la venta): alto coste de inversión inicial y de mantenimiento; el compost se vende como enmienda orgánica a granel.</w:t>
       </w:r>
     </w:p>
     <w:p>
@@ -873,7 +873,7 @@
           <w:color w:val="000000"/>
           <w:lang w:val="es-GT"/>
         </w:rPr>
-        <w:t xml:space="preserve">7) Restaurantes y panaderías como mercado principal de la leña: no se adopta como único mercado porque no hay evidencia local de demanda suficiente; se mantienen como compradores potenciales por validar en el piloto.</w:t>
+        <w:t xml:space="preserve">7) Restaurantes y panaderías como mercado principal: se descarta como único mercado por falta de evidencia local de demanda suficiente; siguen como compradores potenciales por validar en el piloto.</w:t>
       </w:r>
     </w:p>
     <w:p>
@@ -897,7 +897,7 @@
           <w:color w:val="000000"/>
           <w:lang w:val="es-GT"/>
         </w:rPr>
-        <w:t xml:space="preserve">8) Web de intercambio directo de poda entre vecinos: se descarta como solución única porque no incorpora tratamiento ni control de calidad.</w:t>
+        <w:t xml:space="preserve">8) Página web que conectaba vecinos, donde mandaba aviso de podas locales y los demás usuarios podían ir a recoger los residuos orgánicos: no interviene ningún proceso de tratamiento ni de control de calidad.</w:t>
       </w:r>
     </w:p>
     <w:p>

</xml_diff>

<commit_message>
Reemplazar enlace de De Anda-Trasviña et al. por el PDF de la revista
Co-Authored-By: Claude Sonnet 5.5 <noreply@anthropic.com>
Claude-Session: https://claude.ai/code/session_017gE6Pwq5b5gtjDGsqy7MmM
</commit_message>
<xml_diff>
--- a/ACME_ULSA-Nic_RallyLatam2026_corregido.docx
+++ b/ACME_ULSA-Nic_RallyLatam2026_corregido.docx
@@ -1088,7 +1088,7 @@
         </w:rPr>
         <w:t xml:space="preserve">(3), 19–42. </w:t>
       </w:r>
-      <w:hyperlink r:id="rId19" w:history="1">
+      <w:hyperlink r:id="rId11" w:history="1">
         <w:r>
           <w:rPr>
             <w:rStyle w:val="Hipervnculo"/>
@@ -1096,7 +1096,7 @@
             <w:szCs w:val="20"/>
             <w:lang w:val="es-GT"/>
           </w:rPr>
-          <w:t xml:space="preserve">https://doi.org/10.18846/renaysoc.2021.07.07.03.0004</w:t>
+          <w:t xml:space="preserve">https://www.cibnor.gob.mx/revista-rns/pdfs/vol1num3EE/3_RESIDUOS.pdf</w:t>
         </w:r>
       </w:hyperlink>
     </w:p>
@@ -1194,7 +1194,7 @@
         </w:rPr>
         <w:t xml:space="preserve">. Gobierno de Nicaragua. </w:t>
       </w:r>
-      <w:hyperlink r:id="rId20" w:history="1">
+      <w:hyperlink r:id="rId19" w:history="1">
         <w:r>
           <w:rPr>
             <w:rStyle w:val="Hipervnculo"/>
@@ -1300,7 +1300,7 @@
         </w:rPr>
         <w:t xml:space="preserve">. Instituto Nacional de Tecnología Industrial. </w:t>
       </w:r>
-      <w:hyperlink r:id="rId21" w:history="1">
+      <w:hyperlink r:id="rId20" w:history="1">
         <w:r>
           <w:rPr>
             <w:rStyle w:val="Hipervnculo"/>
@@ -1442,7 +1442,7 @@
         </w:rPr>
         <w:t xml:space="preserve"> [Software de modelado y animación 3D]. </w:t>
       </w:r>
-      <w:hyperlink r:id="rId22" w:history="1">
+      <w:hyperlink r:id="rId21" w:history="1">
         <w:r>
           <w:rPr>
             <w:rStyle w:val="Hipervnculo"/>
@@ -1625,7 +1625,7 @@
         </w:rPr>
         <w:t xml:space="preserve"> [Asistente de inteligencia artificial]. </w:t>
       </w:r>
-      <w:hyperlink r:id="rId23" w:history="1">
+      <w:hyperlink r:id="rId22" w:history="1">
         <w:r>
           <w:rPr>
             <w:rStyle w:val="Hipervnculo"/>

</xml_diff>